<commit_message>
Fix hyphenated words split at line breaks in report v2
</commit_message>
<xml_diff>
--- a/docs/report/PhishLens-theory-report-v2.docx
+++ b/docs/report/PhishLens-theory-report-v2.docx
@@ -102,7 +102,7 @@
       <w:pPr>
         <w:pStyle w:val="Heading1"/>
       </w:pPr>
-      <w:bookmarkStart w:id="0" w:name="_Toc243220041"/>
+      <w:bookmarkStart w:id="0" w:name="_Toc243247730"/>
       <w:r>
         <w:t>Contents</w:t>
       </w:r>
@@ -111,7 +111,7 @@
     <w:sdt>
       <w:sdtPr>
         <w:alias w:val="Contents"/>
-        <w:id w:val="-673569120"/>
+        <w:id w:val="-1106728608"/>
       </w:sdtPr>
       <w:sdtEndPr/>
       <w:sdtContent>
@@ -139,7 +139,7 @@
           <w:r>
             <w:fldChar w:fldCharType="separate"/>
           </w:r>
-          <w:hyperlink w:anchor="_Toc243220041" w:history="1">
+          <w:hyperlink w:anchor="_Toc243247730" w:history="1">
             <w:r>
               <w:rPr>
                 <w:rStyle w:val="Hyperlink"/>
@@ -163,7 +163,7 @@
               <w:rPr>
                 <w:noProof/>
               </w:rPr>
-              <w:instrText xml:space="preserve"> PAGEREF _Toc243220041 \h </w:instrText>
+              <w:instrText xml:space="preserve"> PAGEREF _Toc243247730 \h </w:instrText>
             </w:r>
             <w:r>
               <w:rPr>
@@ -205,7 +205,7 @@
               <w14:ligatures w14:val="standardContextual"/>
             </w:rPr>
           </w:pPr>
-          <w:hyperlink w:anchor="_Toc243220042" w:history="1">
+          <w:hyperlink w:anchor="_Toc243247731" w:history="1">
             <w:r>
               <w:rPr>
                 <w:rStyle w:val="Hyperlink"/>
@@ -229,7 +229,7 @@
               <w:rPr>
                 <w:noProof/>
               </w:rPr>
-              <w:instrText xml:space="preserve"> PAGEREF _Toc243220042 \h </w:instrText>
+              <w:instrText xml:space="preserve"> PAGEREF _Toc243247731 \h </w:instrText>
             </w:r>
             <w:r>
               <w:rPr>
@@ -271,7 +271,7 @@
               <w14:ligatures w14:val="standardContextual"/>
             </w:rPr>
           </w:pPr>
-          <w:hyperlink w:anchor="_Toc243220043" w:history="1">
+          <w:hyperlink w:anchor="_Toc243247732" w:history="1">
             <w:r>
               <w:rPr>
                 <w:rStyle w:val="Hyperlink"/>
@@ -295,7 +295,7 @@
               <w:rPr>
                 <w:noProof/>
               </w:rPr>
-              <w:instrText xml:space="preserve"> PAGEREF _Toc243220043 \h </w:instrText>
+              <w:instrText xml:space="preserve"> PAGEREF _Toc243247732 \h </w:instrText>
             </w:r>
             <w:r>
               <w:rPr>
@@ -337,7 +337,7 @@
               <w14:ligatures w14:val="standardContextual"/>
             </w:rPr>
           </w:pPr>
-          <w:hyperlink w:anchor="_Toc243220044" w:history="1">
+          <w:hyperlink w:anchor="_Toc243247733" w:history="1">
             <w:r>
               <w:rPr>
                 <w:rStyle w:val="Hyperlink"/>
@@ -361,7 +361,7 @@
               <w:rPr>
                 <w:noProof/>
               </w:rPr>
-              <w:instrText xml:space="preserve"> PAGEREF _Toc243220044 \h </w:instrText>
+              <w:instrText xml:space="preserve"> PAGEREF _Toc243247733 \h </w:instrText>
             </w:r>
             <w:r>
               <w:rPr>
@@ -403,7 +403,7 @@
               <w14:ligatures w14:val="standardContextual"/>
             </w:rPr>
           </w:pPr>
-          <w:hyperlink w:anchor="_Toc243220045" w:history="1">
+          <w:hyperlink w:anchor="_Toc243247734" w:history="1">
             <w:r>
               <w:rPr>
                 <w:rStyle w:val="Hyperlink"/>
@@ -427,7 +427,7 @@
               <w:rPr>
                 <w:noProof/>
               </w:rPr>
-              <w:instrText xml:space="preserve"> PAGEREF _Toc243220045 \h </w:instrText>
+              <w:instrText xml:space="preserve"> PAGEREF _Toc243247734 \h </w:instrText>
             </w:r>
             <w:r>
               <w:rPr>
@@ -469,7 +469,7 @@
               <w14:ligatures w14:val="standardContextual"/>
             </w:rPr>
           </w:pPr>
-          <w:hyperlink w:anchor="_Toc243220046" w:history="1">
+          <w:hyperlink w:anchor="_Toc243247735" w:history="1">
             <w:r>
               <w:rPr>
                 <w:rStyle w:val="Hyperlink"/>
@@ -493,7 +493,7 @@
               <w:rPr>
                 <w:noProof/>
               </w:rPr>
-              <w:instrText xml:space="preserve"> PAGEREF _Toc243220046 \h </w:instrText>
+              <w:instrText xml:space="preserve"> PAGEREF _Toc243247735 \h </w:instrText>
             </w:r>
             <w:r>
               <w:rPr>
@@ -535,7 +535,7 @@
               <w14:ligatures w14:val="standardContextual"/>
             </w:rPr>
           </w:pPr>
-          <w:hyperlink w:anchor="_Toc243220047" w:history="1">
+          <w:hyperlink w:anchor="_Toc243247736" w:history="1">
             <w:r>
               <w:rPr>
                 <w:rStyle w:val="Hyperlink"/>
@@ -559,7 +559,7 @@
               <w:rPr>
                 <w:noProof/>
               </w:rPr>
-              <w:instrText xml:space="preserve"> PAGEREF _Toc243220047 \h </w:instrText>
+              <w:instrText xml:space="preserve"> PAGEREF _Toc243247736 \h </w:instrText>
             </w:r>
             <w:r>
               <w:rPr>
@@ -601,7 +601,7 @@
               <w14:ligatures w14:val="standardContextual"/>
             </w:rPr>
           </w:pPr>
-          <w:hyperlink w:anchor="_Toc243220048" w:history="1">
+          <w:hyperlink w:anchor="_Toc243247737" w:history="1">
             <w:r>
               <w:rPr>
                 <w:rStyle w:val="Hyperlink"/>
@@ -625,7 +625,7 @@
               <w:rPr>
                 <w:noProof/>
               </w:rPr>
-              <w:instrText xml:space="preserve"> PAGEREF _Toc243220048 \h </w:instrText>
+              <w:instrText xml:space="preserve"> PAGEREF _Toc243247737 \h </w:instrText>
             </w:r>
             <w:r>
               <w:rPr>
@@ -667,7 +667,7 @@
               <w14:ligatures w14:val="standardContextual"/>
             </w:rPr>
           </w:pPr>
-          <w:hyperlink w:anchor="_Toc243220049" w:history="1">
+          <w:hyperlink w:anchor="_Toc243247738" w:history="1">
             <w:r>
               <w:rPr>
                 <w:rStyle w:val="Hyperlink"/>
@@ -691,7 +691,7 @@
               <w:rPr>
                 <w:noProof/>
               </w:rPr>
-              <w:instrText xml:space="preserve"> PAGEREF _Toc243220049 \h </w:instrText>
+              <w:instrText xml:space="preserve"> PAGEREF _Toc243247738 \h </w:instrText>
             </w:r>
             <w:r>
               <w:rPr>
@@ -733,7 +733,7 @@
               <w14:ligatures w14:val="standardContextual"/>
             </w:rPr>
           </w:pPr>
-          <w:hyperlink w:anchor="_Toc243220050" w:history="1">
+          <w:hyperlink w:anchor="_Toc243247739" w:history="1">
             <w:r>
               <w:rPr>
                 <w:rStyle w:val="Hyperlink"/>
@@ -757,7 +757,7 @@
               <w:rPr>
                 <w:noProof/>
               </w:rPr>
-              <w:instrText xml:space="preserve"> PAGEREF _Toc243220050 \h </w:instrText>
+              <w:instrText xml:space="preserve"> PAGEREF _Toc243247739 \h </w:instrText>
             </w:r>
             <w:r>
               <w:rPr>
@@ -799,7 +799,7 @@
               <w14:ligatures w14:val="standardContextual"/>
             </w:rPr>
           </w:pPr>
-          <w:hyperlink w:anchor="_Toc243220051" w:history="1">
+          <w:hyperlink w:anchor="_Toc243247740" w:history="1">
             <w:r>
               <w:rPr>
                 <w:rStyle w:val="Hyperlink"/>
@@ -823,7 +823,7 @@
               <w:rPr>
                 <w:noProof/>
               </w:rPr>
-              <w:instrText xml:space="preserve"> PAGEREF _Toc243220051 \h </w:instrText>
+              <w:instrText xml:space="preserve"> PAGEREF _Toc243247740 \h </w:instrText>
             </w:r>
             <w:r>
               <w:rPr>
@@ -865,7 +865,7 @@
               <w14:ligatures w14:val="standardContextual"/>
             </w:rPr>
           </w:pPr>
-          <w:hyperlink w:anchor="_Toc243220052" w:history="1">
+          <w:hyperlink w:anchor="_Toc243247741" w:history="1">
             <w:r>
               <w:rPr>
                 <w:rStyle w:val="Hyperlink"/>
@@ -889,7 +889,7 @@
               <w:rPr>
                 <w:noProof/>
               </w:rPr>
-              <w:instrText xml:space="preserve"> PAGEREF _Toc243220052 \h </w:instrText>
+              <w:instrText xml:space="preserve"> PAGEREF _Toc243247741 \h </w:instrText>
             </w:r>
             <w:r>
               <w:rPr>
@@ -931,7 +931,7 @@
               <w14:ligatures w14:val="standardContextual"/>
             </w:rPr>
           </w:pPr>
-          <w:hyperlink w:anchor="_Toc243220053" w:history="1">
+          <w:hyperlink w:anchor="_Toc243247742" w:history="1">
             <w:r>
               <w:rPr>
                 <w:rStyle w:val="Hyperlink"/>
@@ -955,7 +955,7 @@
               <w:rPr>
                 <w:noProof/>
               </w:rPr>
-              <w:instrText xml:space="preserve"> PAGEREF _Toc243220053 \h </w:instrText>
+              <w:instrText xml:space="preserve"> PAGEREF _Toc243247742 \h </w:instrText>
             </w:r>
             <w:r>
               <w:rPr>
@@ -997,7 +997,7 @@
               <w14:ligatures w14:val="standardContextual"/>
             </w:rPr>
           </w:pPr>
-          <w:hyperlink w:anchor="_Toc243220054" w:history="1">
+          <w:hyperlink w:anchor="_Toc243247743" w:history="1">
             <w:r>
               <w:rPr>
                 <w:rStyle w:val="Hyperlink"/>
@@ -1021,7 +1021,7 @@
               <w:rPr>
                 <w:noProof/>
               </w:rPr>
-              <w:instrText xml:space="preserve"> PAGEREF _Toc243220054 \h </w:instrText>
+              <w:instrText xml:space="preserve"> PAGEREF _Toc243247743 \h </w:instrText>
             </w:r>
             <w:r>
               <w:rPr>
@@ -1063,7 +1063,7 @@
               <w14:ligatures w14:val="standardContextual"/>
             </w:rPr>
           </w:pPr>
-          <w:hyperlink w:anchor="_Toc243220055" w:history="1">
+          <w:hyperlink w:anchor="_Toc243247744" w:history="1">
             <w:r>
               <w:rPr>
                 <w:rStyle w:val="Hyperlink"/>
@@ -1087,7 +1087,7 @@
               <w:rPr>
                 <w:noProof/>
               </w:rPr>
-              <w:instrText xml:space="preserve"> PAGEREF _Toc243220055 \h </w:instrText>
+              <w:instrText xml:space="preserve"> PAGEREF _Toc243247744 \h </w:instrText>
             </w:r>
             <w:r>
               <w:rPr>
@@ -1129,7 +1129,7 @@
               <w14:ligatures w14:val="standardContextual"/>
             </w:rPr>
           </w:pPr>
-          <w:hyperlink w:anchor="_Toc243220056" w:history="1">
+          <w:hyperlink w:anchor="_Toc243247745" w:history="1">
             <w:r>
               <w:rPr>
                 <w:rStyle w:val="Hyperlink"/>
@@ -1153,7 +1153,7 @@
               <w:rPr>
                 <w:noProof/>
               </w:rPr>
-              <w:instrText xml:space="preserve"> PAGEREF _Toc243220056 \h </w:instrText>
+              <w:instrText xml:space="preserve"> PAGEREF _Toc243247745 \h </w:instrText>
             </w:r>
             <w:r>
               <w:rPr>
@@ -1195,7 +1195,7 @@
               <w14:ligatures w14:val="standardContextual"/>
             </w:rPr>
           </w:pPr>
-          <w:hyperlink w:anchor="_Toc243220057" w:history="1">
+          <w:hyperlink w:anchor="_Toc243247746" w:history="1">
             <w:r>
               <w:rPr>
                 <w:rStyle w:val="Hyperlink"/>
@@ -1219,7 +1219,7 @@
               <w:rPr>
                 <w:noProof/>
               </w:rPr>
-              <w:instrText xml:space="preserve"> PAGEREF _Toc243220057 \h </w:instrText>
+              <w:instrText xml:space="preserve"> PAGEREF _Toc243247746 \h </w:instrText>
             </w:r>
             <w:r>
               <w:rPr>
@@ -1261,7 +1261,7 @@
               <w14:ligatures w14:val="standardContextual"/>
             </w:rPr>
           </w:pPr>
-          <w:hyperlink w:anchor="_Toc243220058" w:history="1">
+          <w:hyperlink w:anchor="_Toc243247747" w:history="1">
             <w:r>
               <w:rPr>
                 <w:rStyle w:val="Hyperlink"/>
@@ -1285,7 +1285,7 @@
               <w:rPr>
                 <w:noProof/>
               </w:rPr>
-              <w:instrText xml:space="preserve"> PAGEREF _Toc243220058 \h </w:instrText>
+              <w:instrText xml:space="preserve"> PAGEREF _Toc243247747 \h </w:instrText>
             </w:r>
             <w:r>
               <w:rPr>
@@ -1327,7 +1327,7 @@
               <w14:ligatures w14:val="standardContextual"/>
             </w:rPr>
           </w:pPr>
-          <w:hyperlink w:anchor="_Toc243220059" w:history="1">
+          <w:hyperlink w:anchor="_Toc243247748" w:history="1">
             <w:r>
               <w:rPr>
                 <w:rStyle w:val="Hyperlink"/>
@@ -1351,7 +1351,7 @@
               <w:rPr>
                 <w:noProof/>
               </w:rPr>
-              <w:instrText xml:space="preserve"> PAGEREF _Toc243220059 \h </w:instrText>
+              <w:instrText xml:space="preserve"> PAGEREF _Toc243247748 \h </w:instrText>
             </w:r>
             <w:r>
               <w:rPr>
@@ -1393,7 +1393,7 @@
               <w14:ligatures w14:val="standardContextual"/>
             </w:rPr>
           </w:pPr>
-          <w:hyperlink w:anchor="_Toc243220060" w:history="1">
+          <w:hyperlink w:anchor="_Toc243247749" w:history="1">
             <w:r>
               <w:rPr>
                 <w:rStyle w:val="Hyperlink"/>
@@ -1417,7 +1417,7 @@
               <w:rPr>
                 <w:noProof/>
               </w:rPr>
-              <w:instrText xml:space="preserve"> PAGEREF _Toc243220060 \h </w:instrText>
+              <w:instrText xml:space="preserve"> PAGEREF _Toc243247749 \h </w:instrText>
             </w:r>
             <w:r>
               <w:rPr>
@@ -1459,7 +1459,7 @@
               <w14:ligatures w14:val="standardContextual"/>
             </w:rPr>
           </w:pPr>
-          <w:hyperlink w:anchor="_Toc243220061" w:history="1">
+          <w:hyperlink w:anchor="_Toc243247750" w:history="1">
             <w:r>
               <w:rPr>
                 <w:rStyle w:val="Hyperlink"/>
@@ -1483,7 +1483,7 @@
               <w:rPr>
                 <w:noProof/>
               </w:rPr>
-              <w:instrText xml:space="preserve"> PAGEREF _Toc243220061 \h </w:instrText>
+              <w:instrText xml:space="preserve"> PAGEREF _Toc243247750 \h </w:instrText>
             </w:r>
             <w:r>
               <w:rPr>
@@ -1525,7 +1525,7 @@
               <w14:ligatures w14:val="standardContextual"/>
             </w:rPr>
           </w:pPr>
-          <w:hyperlink w:anchor="_Toc243220062" w:history="1">
+          <w:hyperlink w:anchor="_Toc243247751" w:history="1">
             <w:r>
               <w:rPr>
                 <w:rStyle w:val="Hyperlink"/>
@@ -1549,7 +1549,7 @@
               <w:rPr>
                 <w:noProof/>
               </w:rPr>
-              <w:instrText xml:space="preserve"> PAGEREF _Toc243220062 \h </w:instrText>
+              <w:instrText xml:space="preserve"> PAGEREF _Toc243247751 \h </w:instrText>
             </w:r>
             <w:r>
               <w:rPr>
@@ -1591,7 +1591,7 @@
               <w14:ligatures w14:val="standardContextual"/>
             </w:rPr>
           </w:pPr>
-          <w:hyperlink w:anchor="_Toc243220063" w:history="1">
+          <w:hyperlink w:anchor="_Toc243247752" w:history="1">
             <w:r>
               <w:rPr>
                 <w:rStyle w:val="Hyperlink"/>
@@ -1615,7 +1615,7 @@
               <w:rPr>
                 <w:noProof/>
               </w:rPr>
-              <w:instrText xml:space="preserve"> PAGEREF _Toc243220063 \h </w:instrText>
+              <w:instrText xml:space="preserve"> PAGEREF _Toc243247752 \h </w:instrText>
             </w:r>
             <w:r>
               <w:rPr>
@@ -1657,7 +1657,7 @@
               <w14:ligatures w14:val="standardContextual"/>
             </w:rPr>
           </w:pPr>
-          <w:hyperlink w:anchor="_Toc243220064" w:history="1">
+          <w:hyperlink w:anchor="_Toc243247753" w:history="1">
             <w:r>
               <w:rPr>
                 <w:rStyle w:val="Hyperlink"/>
@@ -1681,7 +1681,7 @@
               <w:rPr>
                 <w:noProof/>
               </w:rPr>
-              <w:instrText xml:space="preserve"> PAGEREF _Toc243220064 \h </w:instrText>
+              <w:instrText xml:space="preserve"> PAGEREF _Toc243247753 \h </w:instrText>
             </w:r>
             <w:r>
               <w:rPr>
@@ -1723,7 +1723,7 @@
               <w14:ligatures w14:val="standardContextual"/>
             </w:rPr>
           </w:pPr>
-          <w:hyperlink w:anchor="_Toc243220065" w:history="1">
+          <w:hyperlink w:anchor="_Toc243247754" w:history="1">
             <w:r>
               <w:rPr>
                 <w:rStyle w:val="Hyperlink"/>
@@ -1747,7 +1747,7 @@
               <w:rPr>
                 <w:noProof/>
               </w:rPr>
-              <w:instrText xml:space="preserve"> PAGEREF _Toc243220065 \h </w:instrText>
+              <w:instrText xml:space="preserve"> PAGEREF _Toc243247754 \h </w:instrText>
             </w:r>
             <w:r>
               <w:rPr>
@@ -1789,7 +1789,7 @@
               <w14:ligatures w14:val="standardContextual"/>
             </w:rPr>
           </w:pPr>
-          <w:hyperlink w:anchor="_Toc243220066" w:history="1">
+          <w:hyperlink w:anchor="_Toc243247755" w:history="1">
             <w:r>
               <w:rPr>
                 <w:rStyle w:val="Hyperlink"/>
@@ -1813,7 +1813,7 @@
               <w:rPr>
                 <w:noProof/>
               </w:rPr>
-              <w:instrText xml:space="preserve"> PAGEREF _Toc243220066 \h </w:instrText>
+              <w:instrText xml:space="preserve"> PAGEREF _Toc243247755 \h </w:instrText>
             </w:r>
             <w:r>
               <w:rPr>
@@ -1855,7 +1855,7 @@
               <w14:ligatures w14:val="standardContextual"/>
             </w:rPr>
           </w:pPr>
-          <w:hyperlink w:anchor="_Toc243220067" w:history="1">
+          <w:hyperlink w:anchor="_Toc243247756" w:history="1">
             <w:r>
               <w:rPr>
                 <w:rStyle w:val="Hyperlink"/>
@@ -1879,7 +1879,7 @@
               <w:rPr>
                 <w:noProof/>
               </w:rPr>
-              <w:instrText xml:space="preserve"> PAGEREF _Toc243220067 \h </w:instrText>
+              <w:instrText xml:space="preserve"> PAGEREF _Toc243247756 \h </w:instrText>
             </w:r>
             <w:r>
               <w:rPr>
@@ -1921,7 +1921,7 @@
               <w14:ligatures w14:val="standardContextual"/>
             </w:rPr>
           </w:pPr>
-          <w:hyperlink w:anchor="_Toc243220068" w:history="1">
+          <w:hyperlink w:anchor="_Toc243247757" w:history="1">
             <w:r>
               <w:rPr>
                 <w:rStyle w:val="Hyperlink"/>
@@ -1945,7 +1945,7 @@
               <w:rPr>
                 <w:noProof/>
               </w:rPr>
-              <w:instrText xml:space="preserve"> PAGEREF _Toc243220068 \h </w:instrText>
+              <w:instrText xml:space="preserve"> PAGEREF _Toc243247757 \h </w:instrText>
             </w:r>
             <w:r>
               <w:rPr>
@@ -1987,7 +1987,7 @@
               <w14:ligatures w14:val="standardContextual"/>
             </w:rPr>
           </w:pPr>
-          <w:hyperlink w:anchor="_Toc243220069" w:history="1">
+          <w:hyperlink w:anchor="_Toc243247758" w:history="1">
             <w:r>
               <w:rPr>
                 <w:rStyle w:val="Hyperlink"/>
@@ -2011,7 +2011,7 @@
               <w:rPr>
                 <w:noProof/>
               </w:rPr>
-              <w:instrText xml:space="preserve"> PAGEREF _Toc243220069 \h </w:instrText>
+              <w:instrText xml:space="preserve"> PAGEREF _Toc243247758 \h </w:instrText>
             </w:r>
             <w:r>
               <w:rPr>
@@ -2053,7 +2053,7 @@
               <w14:ligatures w14:val="standardContextual"/>
             </w:rPr>
           </w:pPr>
-          <w:hyperlink w:anchor="_Toc243220070" w:history="1">
+          <w:hyperlink w:anchor="_Toc243247759" w:history="1">
             <w:r>
               <w:rPr>
                 <w:rStyle w:val="Hyperlink"/>
@@ -2077,7 +2077,7 @@
               <w:rPr>
                 <w:noProof/>
               </w:rPr>
-              <w:instrText xml:space="preserve"> PAGEREF _Toc243220070 \h </w:instrText>
+              <w:instrText xml:space="preserve"> PAGEREF _Toc243247759 \h </w:instrText>
             </w:r>
             <w:r>
               <w:rPr>
@@ -2119,7 +2119,7 @@
               <w14:ligatures w14:val="standardContextual"/>
             </w:rPr>
           </w:pPr>
-          <w:hyperlink w:anchor="_Toc243220071" w:history="1">
+          <w:hyperlink w:anchor="_Toc243247760" w:history="1">
             <w:r>
               <w:rPr>
                 <w:rStyle w:val="Hyperlink"/>
@@ -2143,7 +2143,7 @@
               <w:rPr>
                 <w:noProof/>
               </w:rPr>
-              <w:instrText xml:space="preserve"> PAGEREF _Toc243220071 \h </w:instrText>
+              <w:instrText xml:space="preserve"> PAGEREF _Toc243247760 \h </w:instrText>
             </w:r>
             <w:r>
               <w:rPr>
@@ -2185,7 +2185,7 @@
               <w14:ligatures w14:val="standardContextual"/>
             </w:rPr>
           </w:pPr>
-          <w:hyperlink w:anchor="_Toc243220072" w:history="1">
+          <w:hyperlink w:anchor="_Toc243247761" w:history="1">
             <w:r>
               <w:rPr>
                 <w:rStyle w:val="Hyperlink"/>
@@ -2209,7 +2209,7 @@
               <w:rPr>
                 <w:noProof/>
               </w:rPr>
-              <w:instrText xml:space="preserve"> PAGEREF _Toc243220072 \h </w:instrText>
+              <w:instrText xml:space="preserve"> PAGEREF _Toc243247761 \h </w:instrText>
             </w:r>
             <w:r>
               <w:rPr>
@@ -2251,7 +2251,7 @@
               <w14:ligatures w14:val="standardContextual"/>
             </w:rPr>
           </w:pPr>
-          <w:hyperlink w:anchor="_Toc243220073" w:history="1">
+          <w:hyperlink w:anchor="_Toc243247762" w:history="1">
             <w:r>
               <w:rPr>
                 <w:rStyle w:val="Hyperlink"/>
@@ -2275,7 +2275,7 @@
               <w:rPr>
                 <w:noProof/>
               </w:rPr>
-              <w:instrText xml:space="preserve"> PAGEREF _Toc243220073 \h </w:instrText>
+              <w:instrText xml:space="preserve"> PAGEREF _Toc243247762 \h </w:instrText>
             </w:r>
             <w:r>
               <w:rPr>
@@ -2317,7 +2317,7 @@
               <w14:ligatures w14:val="standardContextual"/>
             </w:rPr>
           </w:pPr>
-          <w:hyperlink w:anchor="_Toc243220074" w:history="1">
+          <w:hyperlink w:anchor="_Toc243247763" w:history="1">
             <w:r>
               <w:rPr>
                 <w:rStyle w:val="Hyperlink"/>
@@ -2341,7 +2341,7 @@
               <w:rPr>
                 <w:noProof/>
               </w:rPr>
-              <w:instrText xml:space="preserve"> PAGEREF _Toc243220074 \h </w:instrText>
+              <w:instrText xml:space="preserve"> PAGEREF _Toc243247763 \h </w:instrText>
             </w:r>
             <w:r>
               <w:rPr>
@@ -2383,7 +2383,7 @@
               <w14:ligatures w14:val="standardContextual"/>
             </w:rPr>
           </w:pPr>
-          <w:hyperlink w:anchor="_Toc243220075" w:history="1">
+          <w:hyperlink w:anchor="_Toc243247764" w:history="1">
             <w:r>
               <w:rPr>
                 <w:rStyle w:val="Hyperlink"/>
@@ -2407,7 +2407,7 @@
               <w:rPr>
                 <w:noProof/>
               </w:rPr>
-              <w:instrText xml:space="preserve"> PAGEREF _Toc243220075 \h </w:instrText>
+              <w:instrText xml:space="preserve"> PAGEREF _Toc243247764 \h </w:instrText>
             </w:r>
             <w:r>
               <w:rPr>
@@ -2449,7 +2449,7 @@
               <w14:ligatures w14:val="standardContextual"/>
             </w:rPr>
           </w:pPr>
-          <w:hyperlink w:anchor="_Toc243220076" w:history="1">
+          <w:hyperlink w:anchor="_Toc243247765" w:history="1">
             <w:r>
               <w:rPr>
                 <w:rStyle w:val="Hyperlink"/>
@@ -2473,7 +2473,7 @@
               <w:rPr>
                 <w:noProof/>
               </w:rPr>
-              <w:instrText xml:space="preserve"> PAGEREF _Toc243220076 \h </w:instrText>
+              <w:instrText xml:space="preserve"> PAGEREF _Toc243247765 \h </w:instrText>
             </w:r>
             <w:r>
               <w:rPr>
@@ -2515,7 +2515,7 @@
               <w14:ligatures w14:val="standardContextual"/>
             </w:rPr>
           </w:pPr>
-          <w:hyperlink w:anchor="_Toc243220077" w:history="1">
+          <w:hyperlink w:anchor="_Toc243247766" w:history="1">
             <w:r>
               <w:rPr>
                 <w:rStyle w:val="Hyperlink"/>
@@ -2539,7 +2539,7 @@
               <w:rPr>
                 <w:noProof/>
               </w:rPr>
-              <w:instrText xml:space="preserve"> PAGEREF _Toc243220077 \h </w:instrText>
+              <w:instrText xml:space="preserve"> PAGEREF _Toc243247766 \h </w:instrText>
             </w:r>
             <w:r>
               <w:rPr>
@@ -2582,7 +2582,7 @@
       <w:pPr>
         <w:pStyle w:val="Heading1"/>
       </w:pPr>
-      <w:bookmarkStart w:id="1" w:name="_Toc243220042"/>
+      <w:bookmarkStart w:id="1" w:name="_Toc243247731"/>
       <w:r>
         <w:t>1. Model scenario</w:t>
       </w:r>
@@ -2592,7 +2592,7 @@
       <w:pPr>
         <w:pStyle w:val="Heading2"/>
       </w:pPr>
-      <w:bookmarkStart w:id="2" w:name="_Toc243220043"/>
+      <w:bookmarkStart w:id="2" w:name="_Toc243247732"/>
       <w:r>
         <w:t>The operational setting</w:t>
       </w:r>
@@ -2621,7 +2621,7 @@
       <w:pPr>
         <w:pStyle w:val="Heading2"/>
       </w:pPr>
-      <w:bookmarkStart w:id="3" w:name="_Toc243220044"/>
+      <w:bookmarkStart w:id="3" w:name="_Toc243247733"/>
       <w:r>
         <w:t>Why a learned model rather than rules</w:t>
       </w:r>
@@ -2642,7 +2642,7 @@
       <w:pPr>
         <w:pStyle w:val="Heading2"/>
       </w:pPr>
-      <w:bookmarkStart w:id="4" w:name="_Toc243220045"/>
+      <w:bookmarkStart w:id="4" w:name="_Toc243247734"/>
       <w:r>
         <w:t>Why text alone is a deliberate constraint</w:t>
       </w:r>
@@ -2656,14 +2656,14 @@
         <w:t>The model reads subject and body text only. Sender domain, header residue, URL counts and routing metadata are excluded by design, although the raw corpora carry them. Those fields are the strongest predictors available on this data and excluding them lowers the headline score, which is the point. Header and domain features on a pooled research corpus encode which archive a message was drawn from at least as much as they encode phishing, and a model permitted to use them can score well without learning anyt</w:t>
       </w:r>
       <w:r>
-        <w:t>hing about phishing language at all. Section 3 measures how much of that artefact survives even under the text- only constraint. Restricting the input is what makes the resulting claim about phishing language an honest one, and it is also what makes the token-level explanation meaningful to an analyst: highlighted words in the message body are something a person can judge, whereas a weight on a header field is not.</w:t>
+        <w:t>hing about phishing language at all. Section 3 measures how much of that artefact survives even under the text-only constraint. Restricting the input is what makes the resulting claim about phishing language an honest one, and it is also what makes the token-level explanation meaningful to an analyst: highlighted words in the message body are something a person can judge, whereas a weight on a header field is not.</w:t>
       </w:r>
     </w:p>
     <w:p>
       <w:pPr>
         <w:pStyle w:val="Heading2"/>
       </w:pPr>
-      <w:bookmarkStart w:id="5" w:name="_Toc243220046"/>
+      <w:bookmarkStart w:id="5" w:name="_Toc243247735"/>
       <w:r>
         <w:t>What the model is not</w:t>
       </w:r>
@@ -2710,7 +2710,7 @@
       <w:pPr>
         <w:pStyle w:val="Heading1"/>
       </w:pPr>
-      <w:bookmarkStart w:id="6" w:name="_Toc243220047"/>
+      <w:bookmarkStart w:id="6" w:name="_Toc243247736"/>
       <w:r>
         <w:t>2. Model architecture</w:t>
       </w:r>
@@ -2761,7 +2761,7 @@
       <w:pPr>
         <w:pStyle w:val="Heading2"/>
       </w:pPr>
-      <w:bookmarkStart w:id="7" w:name="_Toc243220048"/>
+      <w:bookmarkStart w:id="7" w:name="_Toc243247737"/>
       <w:r>
         <w:t>2.1 Input representation</w:t>
       </w:r>
@@ -2839,7 +2839,7 @@
       <w:pPr>
         <w:pStyle w:val="Heading2"/>
       </w:pPr>
-      <w:bookmarkStart w:id="8" w:name="_Toc243220049"/>
+      <w:bookmarkStart w:id="8" w:name="_Toc243247738"/>
       <w:r>
         <w:t>2.2 Layers</w:t>
       </w:r>
@@ -3627,7 +3627,7 @@
       <w:pPr>
         <w:pStyle w:val="Heading2"/>
       </w:pPr>
-      <w:bookmarkStart w:id="9" w:name="_Toc243220050"/>
+      <w:bookmarkStart w:id="9" w:name="_Toc243247739"/>
       <w:r>
         <w:t>2.3 Class weighting</w:t>
       </w:r>
@@ -3648,7 +3648,7 @@
       <w:pPr>
         <w:pStyle w:val="Heading2"/>
       </w:pPr>
-      <w:bookmarkStart w:id="10" w:name="_Toc243220051"/>
+      <w:bookmarkStart w:id="10" w:name="_Toc243247740"/>
       <w:r>
         <w:t>2.4 Training loop, patience and best-weight restore</w:t>
       </w:r>
@@ -3761,7 +3761,7 @@
         <w:spacing w:after="160"/>
       </w:pPr>
       <w:r>
-        <w:t>This restore is the guarantee behind every number in section 3. Training ran for six epochs and the best validation macro-F1 was reached at epoch 6 (0.98665, against 0.98624 at epoch 4). The reported test metrics come from the restored best epoch, not from whichever epoch training happened to end on. Reporting last- epoch numbers after early stopping is a common and silent error: it reports a model that was deliberately rejected.</w:t>
+        <w:t>This restore is the guarantee behind every number in section 3. Training ran for six epochs and the best validation macro-F1 was reached at epoch 6 (0.98665, against 0.98624 at epoch 4). The reported test metrics come from the restored best epoch, not from whichever epoch training happened to end on. Reporting last-epoch numbers after early stopping is a common and silent error: it reports a model that was deliberately rejected.</w:t>
       </w:r>
     </w:p>
     <w:p>
@@ -3776,7 +3776,7 @@
       <w:pPr>
         <w:pStyle w:val="Heading2"/>
       </w:pPr>
-      <w:bookmarkStart w:id="11" w:name="_Toc243220052"/>
+      <w:bookmarkStart w:id="11" w:name="_Toc243247741"/>
       <w:r>
         <w:t>2.5 Why this architecture rather than an LSTM or a transformer</w:t>
       </w:r>
@@ -3815,7 +3815,7 @@
       <w:pPr>
         <w:pStyle w:val="Heading2"/>
       </w:pPr>
-      <w:bookmarkStart w:id="12" w:name="_Toc243220053"/>
+      <w:bookmarkStart w:id="12" w:name="_Toc243247742"/>
       <w:r>
         <w:t>References cited in this section</w:t>
       </w:r>
@@ -3866,7 +3866,7 @@
       <w:pPr>
         <w:pStyle w:val="Heading1"/>
       </w:pPr>
-      <w:bookmarkStart w:id="13" w:name="_Toc243220054"/>
+      <w:bookmarkStart w:id="13" w:name="_Toc243247743"/>
       <w:r>
         <w:t>3. Model result analysis</w:t>
       </w:r>
@@ -3895,7 +3895,7 @@
       <w:pPr>
         <w:pStyle w:val="Heading2"/>
       </w:pPr>
-      <w:bookmarkStart w:id="14" w:name="_Toc243220055"/>
+      <w:bookmarkStart w:id="14" w:name="_Toc243247744"/>
       <w:r>
         <w:t>3.1 Headline results on the random split</w:t>
       </w:r>
@@ -5271,7 +5271,7 @@
           <w:noProof/>
         </w:rPr>
         <w:drawing>
-          <wp:inline distT="0" distB="0" distL="0" distR="0" wp14:anchorId="2DDCB563" wp14:editId="072768A4">
+          <wp:inline distT="0" distB="0" distL="0" distR="0" wp14:anchorId="35BBF74C" wp14:editId="070AF1C9">
             <wp:extent cx="4095750" cy="4152900"/>
             <wp:effectExtent l="0" t="0" r="0" b="0"/>
             <wp:docPr id="1" name="Picture 1"/>
@@ -5336,10 +5336,10 @@
           <w:noProof/>
         </w:rPr>
         <w:drawing>
-          <wp:inline distT="0" distB="0" distL="0" distR="0" wp14:anchorId="0DE60E9C" wp14:editId="4DCB1E89">
+          <wp:inline distT="0" distB="0" distL="0" distR="0" wp14:anchorId="49EA50F5" wp14:editId="3D30B5E6">
             <wp:extent cx="4095750" cy="4152900"/>
             <wp:effectExtent l="0" t="0" r="0" b="0"/>
-            <wp:docPr id="1684134740" name="Picture 1684134740"/>
+            <wp:docPr id="771579726" name="Picture 771579726"/>
             <wp:cNvGraphicFramePr>
               <a:graphicFrameLocks xmlns:a="http://schemas.openxmlformats.org/drawingml/2006/main" noChangeAspect="1"/>
             </wp:cNvGraphicFramePr>
@@ -5401,10 +5401,10 @@
           <w:noProof/>
         </w:rPr>
         <w:drawing>
-          <wp:inline distT="0" distB="0" distL="0" distR="0" wp14:anchorId="045F3987" wp14:editId="542E95A8">
+          <wp:inline distT="0" distB="0" distL="0" distR="0" wp14:anchorId="10BF0BCE" wp14:editId="0C3489BF">
             <wp:extent cx="4095750" cy="3371850"/>
             <wp:effectExtent l="0" t="0" r="0" b="0"/>
-            <wp:docPr id="274852963" name="Picture 274852963"/>
+            <wp:docPr id="1586780035" name="Picture 1586780035"/>
             <wp:cNvGraphicFramePr>
               <a:graphicFrameLocks xmlns:a="http://schemas.openxmlformats.org/drawingml/2006/main" noChangeAspect="1"/>
             </wp:cNvGraphicFramePr>
@@ -5466,10 +5466,10 @@
           <w:noProof/>
         </w:rPr>
         <w:drawing>
-          <wp:inline distT="0" distB="0" distL="0" distR="0" wp14:anchorId="1A302EEB" wp14:editId="45849B87">
+          <wp:inline distT="0" distB="0" distL="0" distR="0" wp14:anchorId="569528CC" wp14:editId="334AEDBB">
             <wp:extent cx="4095750" cy="3400425"/>
             <wp:effectExtent l="0" t="0" r="0" b="0"/>
-            <wp:docPr id="882905370" name="Picture 882905370"/>
+            <wp:docPr id="1160718848" name="Picture 1160718848"/>
             <wp:cNvGraphicFramePr>
               <a:graphicFrameLocks xmlns:a="http://schemas.openxmlformats.org/drawingml/2006/main" noChangeAspect="1"/>
             </wp:cNvGraphicFramePr>
@@ -5540,7 +5540,7 @@
       <w:pPr>
         <w:pStyle w:val="Heading2"/>
       </w:pPr>
-      <w:bookmarkStart w:id="15" w:name="_Toc243220056"/>
+      <w:bookmarkStart w:id="15" w:name="_Toc243247745"/>
       <w:r>
         <w:t>3.2 Training behaviour and early stopping</w:t>
       </w:r>
@@ -6473,7 +6473,7 @@
       <w:pPr>
         <w:pStyle w:val="Heading2"/>
       </w:pPr>
-      <w:bookmarkStart w:id="16" w:name="_Toc243220057"/>
+      <w:bookmarkStart w:id="16" w:name="_Toc243247746"/>
       <w:r>
         <w:t>3.3 The corpus probe: what the headline number partly measures</w:t>
       </w:r>
@@ -7033,7 +7033,7 @@
       <w:pPr>
         <w:pStyle w:val="Heading2"/>
       </w:pPr>
-      <w:bookmarkStart w:id="17" w:name="_Toc243220058"/>
+      <w:bookmarkStart w:id="17" w:name="_Toc243247747"/>
       <w:r>
         <w:t>3.4 Leave-one-corpus-out evaluation</w:t>
       </w:r>
@@ -8750,7 +8750,7 @@
       <w:pPr>
         <w:pStyle w:val="Heading2"/>
       </w:pPr>
-      <w:bookmarkStart w:id="18" w:name="_Toc243220059"/>
+      <w:bookmarkStart w:id="18" w:name="_Toc243247748"/>
       <w:r>
         <w:t>3.5 False positives and what the explanations reveal</w:t>
       </w:r>
@@ -8797,10 +8797,10 @@
           <w:noProof/>
         </w:rPr>
         <w:drawing>
-          <wp:inline distT="0" distB="0" distL="0" distR="0" wp14:anchorId="0B4F5FB1" wp14:editId="7F16AE03">
+          <wp:inline distT="0" distB="0" distL="0" distR="0" wp14:anchorId="5C8EEDAF" wp14:editId="724128BD">
             <wp:extent cx="4095750" cy="4095750"/>
             <wp:effectExtent l="0" t="0" r="0" b="0"/>
-            <wp:docPr id="521533158" name="Picture 521533158"/>
+            <wp:docPr id="1655426161" name="Picture 1655426161"/>
             <wp:cNvGraphicFramePr>
               <a:graphicFrameLocks xmlns:a="http://schemas.openxmlformats.org/drawingml/2006/main" noChangeAspect="1"/>
             </wp:cNvGraphicFramePr>
@@ -9007,10 +9007,10 @@
           <w:noProof/>
         </w:rPr>
         <w:drawing>
-          <wp:inline distT="0" distB="0" distL="0" distR="0" wp14:anchorId="241EA972" wp14:editId="475733BC">
+          <wp:inline distT="0" distB="0" distL="0" distR="0" wp14:anchorId="48C4D684" wp14:editId="42666988">
             <wp:extent cx="4095750" cy="3362325"/>
             <wp:effectExtent l="0" t="0" r="0" b="0"/>
-            <wp:docPr id="991722006" name="Picture 991722006"/>
+            <wp:docPr id="910886813" name="Picture 910886813"/>
             <wp:cNvGraphicFramePr>
               <a:graphicFrameLocks xmlns:a="http://schemas.openxmlformats.org/drawingml/2006/main" noChangeAspect="1"/>
             </wp:cNvGraphicFramePr>
@@ -9206,7 +9206,7 @@
       <w:pPr>
         <w:pStyle w:val="Heading2"/>
       </w:pPr>
-      <w:bookmarkStart w:id="19" w:name="_Toc243220060"/>
+      <w:bookmarkStart w:id="19" w:name="_Toc243247749"/>
       <w:r>
         <w:t>3.6 Verdict: is the model effective?</w:t>
       </w:r>
@@ -9255,7 +9255,7 @@
       <w:pPr>
         <w:pStyle w:val="Heading2"/>
       </w:pPr>
-      <w:bookmarkStart w:id="20" w:name="_Toc243220061"/>
+      <w:bookmarkStart w:id="20" w:name="_Toc243247750"/>
       <w:r>
         <w:t>References cited in this section</w:t>
       </w:r>
@@ -9352,7 +9352,7 @@
       <w:pPr>
         <w:pStyle w:val="Heading1"/>
       </w:pPr>
-      <w:bookmarkStart w:id="21" w:name="_Toc243220062"/>
+      <w:bookmarkStart w:id="21" w:name="_Toc243247751"/>
       <w:r>
         <w:t>4. Real-world use of machine learning in cybersecurity</w:t>
       </w:r>
@@ -9362,7 +9362,7 @@
       <w:pPr>
         <w:pStyle w:val="Heading2"/>
       </w:pPr>
-      <w:bookmarkStart w:id="22" w:name="_Toc243220063"/>
+      <w:bookmarkStart w:id="22" w:name="_Toc243247752"/>
       <w:r>
         <w:t>4.1 The four application areas</w:t>
       </w:r>
@@ -9444,7 +9444,7 @@
       <w:pPr>
         <w:pStyle w:val="Heading2"/>
       </w:pPr>
-      <w:bookmarkStart w:id="23" w:name="_Toc243220064"/>
+      <w:bookmarkStart w:id="23" w:name="_Toc243247753"/>
       <w:r>
         <w:t>4.2 Data quality</w:t>
       </w:r>
@@ -9481,7 +9481,7 @@
       <w:pPr>
         <w:pStyle w:val="Heading2"/>
       </w:pPr>
-      <w:bookmarkStart w:id="24" w:name="_Toc243220065"/>
+      <w:bookmarkStart w:id="24" w:name="_Toc243247754"/>
       <w:r>
         <w:t>4.3 Concept drift</w:t>
       </w:r>
@@ -9538,7 +9538,7 @@
       <w:pPr>
         <w:pStyle w:val="Heading2"/>
       </w:pPr>
-      <w:bookmarkStart w:id="25" w:name="_Toc243220066"/>
+      <w:bookmarkStart w:id="25" w:name="_Toc243247755"/>
       <w:r>
         <w:t>4.4 False positives and the alert budget</w:t>
       </w:r>
@@ -9603,7 +9603,7 @@
       <w:pPr>
         <w:pStyle w:val="Heading2"/>
       </w:pPr>
-      <w:bookmarkStart w:id="26" w:name="_Toc243220067"/>
+      <w:bookmarkStart w:id="26" w:name="_Toc243247756"/>
       <w:r>
         <w:t>4.5 The research-to-deployment gap</w:t>
       </w:r>
@@ -9657,7 +9657,7 @@
       <w:pPr>
         <w:pStyle w:val="Heading2"/>
       </w:pPr>
-      <w:bookmarkStart w:id="27" w:name="_Toc243220068"/>
+      <w:bookmarkStart w:id="27" w:name="_Toc243247757"/>
       <w:r>
         <w:t>4.6 What this project's results imply for deploying its own model</w:t>
       </w:r>
@@ -9702,7 +9702,7 @@
       <w:pPr>
         <w:pStyle w:val="Heading2"/>
       </w:pPr>
-      <w:bookmarkStart w:id="28" w:name="_Toc243220069"/>
+      <w:bookmarkStart w:id="28" w:name="_Toc243247758"/>
       <w:r>
         <w:t>References cited in this section</w:t>
       </w:r>
@@ -9799,7 +9799,7 @@
       <w:pPr>
         <w:pStyle w:val="Heading1"/>
       </w:pPr>
-      <w:bookmarkStart w:id="29" w:name="_Toc243220070"/>
+      <w:bookmarkStart w:id="29" w:name="_Toc243247759"/>
       <w:r>
         <w:t>5. System implementation and deployment</w:t>
       </w:r>
@@ -9817,7 +9817,7 @@
       <w:pPr>
         <w:pStyle w:val="Heading2"/>
       </w:pPr>
-      <w:bookmarkStart w:id="30" w:name="_Toc243220071"/>
+      <w:bookmarkStart w:id="30" w:name="_Toc243247760"/>
       <w:r>
         <w:t>5.1 Architecture</w:t>
       </w:r>
@@ -10053,7 +10053,7 @@
       <w:pPr>
         <w:pStyle w:val="Heading2"/>
       </w:pPr>
-      <w:bookmarkStart w:id="31" w:name="_Toc243220072"/>
+      <w:bookmarkStart w:id="31" w:name="_Toc243247761"/>
       <w:r>
         <w:t>5.2 Three clients</w:t>
       </w:r>
@@ -10129,10 +10129,10 @@
           <w:noProof/>
         </w:rPr>
         <w:drawing>
-          <wp:inline distT="0" distB="0" distL="0" distR="0" wp14:anchorId="77688B69" wp14:editId="00B92C5E">
+          <wp:inline distT="0" distB="0" distL="0" distR="0" wp14:anchorId="6DEB6F9A" wp14:editId="7C25680B">
             <wp:extent cx="4095750" cy="3952875"/>
             <wp:effectExtent l="0" t="0" r="0" b="0"/>
-            <wp:docPr id="1682221621" name="Picture 1682221621"/>
+            <wp:docPr id="851483228" name="Picture 851483228"/>
             <wp:cNvGraphicFramePr>
               <a:graphicFrameLocks xmlns:a="http://schemas.openxmlformats.org/drawingml/2006/main" noChangeAspect="1"/>
             </wp:cNvGraphicFramePr>
@@ -10194,10 +10194,10 @@
           <w:noProof/>
         </w:rPr>
         <w:drawing>
-          <wp:inline distT="0" distB="0" distL="0" distR="0" wp14:anchorId="5AE7B0F1" wp14:editId="057C007F">
+          <wp:inline distT="0" distB="0" distL="0" distR="0" wp14:anchorId="42156D00" wp14:editId="4B036E58">
             <wp:extent cx="4095750" cy="3724275"/>
             <wp:effectExtent l="0" t="0" r="0" b="0"/>
-            <wp:docPr id="361290978" name="Picture 361290978"/>
+            <wp:docPr id="944865713" name="Picture 944865713"/>
             <wp:cNvGraphicFramePr>
               <a:graphicFrameLocks xmlns:a="http://schemas.openxmlformats.org/drawingml/2006/main" noChangeAspect="1"/>
             </wp:cNvGraphicFramePr>
@@ -10296,10 +10296,10 @@
           <w:noProof/>
         </w:rPr>
         <w:drawing>
-          <wp:inline distT="0" distB="0" distL="0" distR="0" wp14:anchorId="012BB925" wp14:editId="056A6BFB">
+          <wp:inline distT="0" distB="0" distL="0" distR="0" wp14:anchorId="5DACFB89" wp14:editId="503AA13E">
             <wp:extent cx="4095750" cy="2638425"/>
             <wp:effectExtent l="0" t="0" r="0" b="0"/>
-            <wp:docPr id="1203210869" name="Picture 1203210869"/>
+            <wp:docPr id="808505802" name="Picture 808505802"/>
             <wp:cNvGraphicFramePr>
               <a:graphicFrameLocks xmlns:a="http://schemas.openxmlformats.org/drawingml/2006/main" noChangeAspect="1"/>
             </wp:cNvGraphicFramePr>
@@ -10409,10 +10409,10 @@
           <w:noProof/>
         </w:rPr>
         <w:drawing>
-          <wp:inline distT="0" distB="0" distL="0" distR="0" wp14:anchorId="5EBD1DC0" wp14:editId="182B427A">
+          <wp:inline distT="0" distB="0" distL="0" distR="0" wp14:anchorId="7448A5A1" wp14:editId="22071716">
             <wp:extent cx="4095750" cy="2476500"/>
             <wp:effectExtent l="0" t="0" r="0" b="0"/>
-            <wp:docPr id="110208584" name="Picture 110208584"/>
+            <wp:docPr id="1792241273" name="Picture 1792241273"/>
             <wp:cNvGraphicFramePr>
               <a:graphicFrameLocks xmlns:a="http://schemas.openxmlformats.org/drawingml/2006/main" noChangeAspect="1"/>
             </wp:cNvGraphicFramePr>
@@ -10475,7 +10475,7 @@
       <w:pPr>
         <w:pStyle w:val="Heading2"/>
       </w:pPr>
-      <w:bookmarkStart w:id="32" w:name="_Toc243220073"/>
+      <w:bookmarkStart w:id="32" w:name="_Toc243247762"/>
       <w:r>
         <w:t>5.3 Hosting</w:t>
       </w:r>
@@ -10536,10 +10536,10 @@
           <w:noProof/>
         </w:rPr>
         <w:drawing>
-          <wp:inline distT="0" distB="0" distL="0" distR="0" wp14:anchorId="4EA1EFE0" wp14:editId="357C4F00">
+          <wp:inline distT="0" distB="0" distL="0" distR="0" wp14:anchorId="050D7BBD" wp14:editId="7150C5D8">
             <wp:extent cx="4095750" cy="3448050"/>
             <wp:effectExtent l="0" t="0" r="0" b="0"/>
-            <wp:docPr id="607676458" name="Picture 607676458"/>
+            <wp:docPr id="1701749273" name="Picture 1701749273"/>
             <wp:cNvGraphicFramePr>
               <a:graphicFrameLocks xmlns:a="http://schemas.openxmlformats.org/drawingml/2006/main" noChangeAspect="1"/>
             </wp:cNvGraphicFramePr>
@@ -10605,7 +10605,7 @@
       <w:pPr>
         <w:pStyle w:val="Heading2"/>
       </w:pPr>
-      <w:bookmarkStart w:id="33" w:name="_Toc243220074"/>
+      <w:bookmarkStart w:id="33" w:name="_Toc243247763"/>
       <w:r>
         <w:t>5.4 Security</w:t>
       </w:r>
@@ -10800,7 +10800,7 @@
       <w:pPr>
         <w:pStyle w:val="Heading2"/>
       </w:pPr>
-      <w:bookmarkStart w:id="34" w:name="_Toc243220075"/>
+      <w:bookmarkStart w:id="34" w:name="_Toc243247764"/>
       <w:r>
         <w:t>5.5 Testing and reproducibility</w:t>
       </w:r>
@@ -10828,10 +10828,10 @@
           <w:noProof/>
         </w:rPr>
         <w:drawing>
-          <wp:inline distT="0" distB="0" distL="0" distR="0" wp14:anchorId="7CEF78AE" wp14:editId="09F5A892">
+          <wp:inline distT="0" distB="0" distL="0" distR="0" wp14:anchorId="42C2D48C" wp14:editId="4760DA0C">
             <wp:extent cx="4095750" cy="1800225"/>
             <wp:effectExtent l="0" t="0" r="0" b="0"/>
-            <wp:docPr id="1567990026" name="Picture 1567990026"/>
+            <wp:docPr id="979263482" name="Picture 979263482"/>
             <wp:cNvGraphicFramePr>
               <a:graphicFrameLocks xmlns:a="http://schemas.openxmlformats.org/drawingml/2006/main" noChangeAspect="1"/>
             </wp:cNvGraphicFramePr>
@@ -10894,7 +10894,7 @@
       <w:pPr>
         <w:pStyle w:val="Heading2"/>
       </w:pPr>
-      <w:bookmarkStart w:id="35" w:name="_Toc243220076"/>
+      <w:bookmarkStart w:id="35" w:name="_Toc243247765"/>
       <w:r>
         <w:t>5.6 What the system demonstrates</w:t>
       </w:r>
@@ -10915,7 +10915,7 @@
       <w:pPr>
         <w:pStyle w:val="Heading2"/>
       </w:pPr>
-      <w:bookmarkStart w:id="36" w:name="_Toc243220077"/>
+      <w:bookmarkStart w:id="36" w:name="_Toc243247766"/>
       <w:r>
         <w:t>References cited in this section</w:t>
       </w:r>
@@ -11042,10 +11042,96 @@
 <file path=word/numbering.xml><?xml version="1.0" encoding="utf-8"?>
 <w:numbering xmlns:wpc="http://schemas.microsoft.com/office/word/2010/wordprocessingCanvas" xmlns:cx="http://schemas.microsoft.com/office/drawing/2014/chartex" xmlns:cx1="http://schemas.microsoft.com/office/drawing/2015/9/8/chartex" xmlns:cx2="http://schemas.microsoft.com/office/drawing/2015/10/21/chartex" xmlns:cx3="http://schemas.microsoft.com/office/drawing/2016/5/9/chartex" xmlns:cx4="http://schemas.microsoft.com/office/drawing/2016/5/10/chartex" xmlns:cx5="http://schemas.microsoft.com/office/drawing/2016/5/11/chartex" xmlns:cx6="http://schemas.microsoft.com/office/drawing/2016/5/12/chartex" xmlns:cx7="http://schemas.microsoft.com/office/drawing/2016/5/13/chartex" xmlns:cx8="http://schemas.microsoft.com/office/drawing/2016/5/14/chartex" xmlns:mc="http://schemas.openxmlformats.org/markup-compatibility/2006" xmlns:aink="http://schemas.microsoft.com/office/drawing/2016/ink" xmlns:am3d="http://schemas.microsoft.com/office/drawing/2017/model3d" xmlns:o="urn:schemas-microsoft-com:office:office" xmlns:oel="http://schemas.microsoft.com/office/2019/extlst" xmlns:r="http://schemas.openxmlformats.org/officeDocument/2006/relationships" xmlns:m="http://schemas.openxmlformats.org/officeDocument/2006/math" xmlns:v="urn:schemas-microsoft-com:vml" xmlns:wp14="http://schemas.microsoft.com/office/word/2010/wordprocessingDrawing" xmlns:wp="http://schemas.openxmlformats.org/drawingml/2006/wordprocessingDrawing" xmlns:w10="urn:schemas-microsoft-com:office:word" xmlns:w="http://schemas.openxmlformats.org/wordprocessingml/2006/main" xmlns:w14="http://schemas.microsoft.com/office/word/2010/wordml" xmlns:w15="http://schemas.microsoft.com/office/word/2012/wordml" xmlns:w16cex="http://schemas.microsoft.com/office/word/2018/wordml/cex" xmlns:w16cid="http://schemas.microsoft.com/office/word/2016/wordml/cid" xmlns:w16="http://schemas.microsoft.com/office/word/2018/wordml" xmlns:w16du="http://schemas.microsoft.com/office/word/2023/wordml/word16du" xmlns:w16sdtdh="http://schemas.microsoft.com/office/word/2020/wordml/sdtdatahash" xmlns:w16sdtfl="http://schemas.microsoft.com/office/word/2024/wordml/sdtformatlock" xmlns:w16se="http://schemas.microsoft.com/office/word/2015/wordml/symex" xmlns:wpg="http://schemas.microsoft.com/office/word/2010/wordprocessingGroup" xmlns:wpi="http://schemas.microsoft.com/office/word/2010/wordprocessingInk" xmlns:wne="http://schemas.microsoft.com/office/word/2006/wordml" xmlns:wps="http://schemas.microsoft.com/office/word/2010/wordprocessingShape" mc:Ignorable="w14 w15 w16se w16cid w16 w16cex w16sdtdh w16sdtfl w16du wp14">
   <w:abstractNum w:abstractNumId="0" w15:restartNumberingAfterBreak="0">
-    <w:nsid w:val="59D80054"/>
+    <w:nsid w:val="072A0453"/>
     <w:multiLevelType w:val="hybridMultilevel"/>
-    <w:tmpl w:val="853A9C40"/>
-    <w:lvl w:ilvl="0" w:tplc="BBEE4630">
+    <w:tmpl w:val="285CA11C"/>
+    <w:lvl w:ilvl="0" w:tplc="367C9B1C">
+      <w:start w:val="1"/>
+      <w:numFmt w:val="bullet"/>
+      <w:lvlText w:val="●"/>
+      <w:lvlJc w:val="left"/>
+      <w:pPr>
+        <w:ind w:left="720" w:hanging="360"/>
+      </w:pPr>
+    </w:lvl>
+    <w:lvl w:ilvl="1" w:tplc="FBBE5786">
+      <w:start w:val="1"/>
+      <w:numFmt w:val="bullet"/>
+      <w:lvlText w:val="○"/>
+      <w:lvlJc w:val="left"/>
+      <w:pPr>
+        <w:ind w:left="1440" w:hanging="360"/>
+      </w:pPr>
+    </w:lvl>
+    <w:lvl w:ilvl="2" w:tplc="3CC6CDDC">
+      <w:start w:val="1"/>
+      <w:numFmt w:val="bullet"/>
+      <w:lvlText w:val="■"/>
+      <w:lvlJc w:val="left"/>
+      <w:pPr>
+        <w:ind w:left="2160" w:hanging="360"/>
+      </w:pPr>
+    </w:lvl>
+    <w:lvl w:ilvl="3" w:tplc="156AE3C4">
+      <w:start w:val="1"/>
+      <w:numFmt w:val="bullet"/>
+      <w:lvlText w:val="●"/>
+      <w:lvlJc w:val="left"/>
+      <w:pPr>
+        <w:ind w:left="2880" w:hanging="360"/>
+      </w:pPr>
+    </w:lvl>
+    <w:lvl w:ilvl="4" w:tplc="87183A16">
+      <w:start w:val="1"/>
+      <w:numFmt w:val="bullet"/>
+      <w:lvlText w:val="○"/>
+      <w:lvlJc w:val="left"/>
+      <w:pPr>
+        <w:ind w:left="3600" w:hanging="360"/>
+      </w:pPr>
+    </w:lvl>
+    <w:lvl w:ilvl="5" w:tplc="DF348716">
+      <w:start w:val="1"/>
+      <w:numFmt w:val="bullet"/>
+      <w:lvlText w:val="■"/>
+      <w:lvlJc w:val="left"/>
+      <w:pPr>
+        <w:ind w:left="4320" w:hanging="360"/>
+      </w:pPr>
+    </w:lvl>
+    <w:lvl w:ilvl="6" w:tplc="DF28C2EA">
+      <w:start w:val="1"/>
+      <w:numFmt w:val="bullet"/>
+      <w:lvlText w:val="●"/>
+      <w:lvlJc w:val="left"/>
+      <w:pPr>
+        <w:ind w:left="5040" w:hanging="360"/>
+      </w:pPr>
+    </w:lvl>
+    <w:lvl w:ilvl="7" w:tplc="2A94D1A6">
+      <w:start w:val="1"/>
+      <w:numFmt w:val="bullet"/>
+      <w:lvlText w:val="●"/>
+      <w:lvlJc w:val="left"/>
+      <w:pPr>
+        <w:ind w:left="5760" w:hanging="360"/>
+      </w:pPr>
+    </w:lvl>
+    <w:lvl w:ilvl="8" w:tplc="5EC8B128">
+      <w:start w:val="1"/>
+      <w:numFmt w:val="bullet"/>
+      <w:lvlText w:val="●"/>
+      <w:lvlJc w:val="left"/>
+      <w:pPr>
+        <w:ind w:left="6480" w:hanging="360"/>
+      </w:pPr>
+    </w:lvl>
+  </w:abstractNum>
+  <w:abstractNum w:abstractNumId="1" w15:restartNumberingAfterBreak="0">
+    <w:nsid w:val="6A4F2819"/>
+    <w:multiLevelType w:val="hybridMultilevel"/>
+    <w:tmpl w:val="045205D2"/>
+    <w:lvl w:ilvl="0" w:tplc="8138DA34">
       <w:start w:val="1"/>
       <w:numFmt w:val="bullet"/>
       <w:lvlText w:val="•"/>
@@ -11054,141 +11140,55 @@
         <w:ind w:left="720" w:hanging="360"/>
       </w:pPr>
     </w:lvl>
-    <w:lvl w:ilvl="1" w:tplc="FCD4EDFE">
+    <w:lvl w:ilvl="1" w:tplc="AD9605C2">
       <w:numFmt w:val="decimal"/>
       <w:lvlText w:val=""/>
       <w:lvlJc w:val="left"/>
     </w:lvl>
-    <w:lvl w:ilvl="2" w:tplc="D3D6389E">
+    <w:lvl w:ilvl="2" w:tplc="234ECF54">
       <w:numFmt w:val="decimal"/>
       <w:lvlText w:val=""/>
       <w:lvlJc w:val="left"/>
     </w:lvl>
-    <w:lvl w:ilvl="3" w:tplc="65084868">
+    <w:lvl w:ilvl="3" w:tplc="85F8E8C2">
       <w:numFmt w:val="decimal"/>
       <w:lvlText w:val=""/>
       <w:lvlJc w:val="left"/>
     </w:lvl>
-    <w:lvl w:ilvl="4" w:tplc="0B2032E2">
+    <w:lvl w:ilvl="4" w:tplc="D744C476">
       <w:numFmt w:val="decimal"/>
       <w:lvlText w:val=""/>
       <w:lvlJc w:val="left"/>
     </w:lvl>
-    <w:lvl w:ilvl="5" w:tplc="665C4C64">
+    <w:lvl w:ilvl="5" w:tplc="907C8CE0">
       <w:numFmt w:val="decimal"/>
       <w:lvlText w:val=""/>
       <w:lvlJc w:val="left"/>
     </w:lvl>
-    <w:lvl w:ilvl="6" w:tplc="2B14E346">
+    <w:lvl w:ilvl="6" w:tplc="F258BB74">
       <w:numFmt w:val="decimal"/>
       <w:lvlText w:val=""/>
       <w:lvlJc w:val="left"/>
     </w:lvl>
-    <w:lvl w:ilvl="7" w:tplc="7CECF12C">
+    <w:lvl w:ilvl="7" w:tplc="E9028674">
       <w:numFmt w:val="decimal"/>
       <w:lvlText w:val=""/>
       <w:lvlJc w:val="left"/>
     </w:lvl>
-    <w:lvl w:ilvl="8" w:tplc="D2EA0A52">
+    <w:lvl w:ilvl="8" w:tplc="89A87248">
       <w:numFmt w:val="decimal"/>
       <w:lvlText w:val=""/>
       <w:lvlJc w:val="left"/>
     </w:lvl>
   </w:abstractNum>
-  <w:abstractNum w:abstractNumId="1" w15:restartNumberingAfterBreak="0">
-    <w:nsid w:val="6F445334"/>
-    <w:multiLevelType w:val="hybridMultilevel"/>
-    <w:tmpl w:val="9322E474"/>
-    <w:lvl w:ilvl="0" w:tplc="FD0EAC96">
-      <w:start w:val="1"/>
-      <w:numFmt w:val="bullet"/>
-      <w:lvlText w:val="●"/>
-      <w:lvlJc w:val="left"/>
-      <w:pPr>
-        <w:ind w:left="720" w:hanging="360"/>
-      </w:pPr>
-    </w:lvl>
-    <w:lvl w:ilvl="1" w:tplc="91DE8628">
-      <w:start w:val="1"/>
-      <w:numFmt w:val="bullet"/>
-      <w:lvlText w:val="○"/>
-      <w:lvlJc w:val="left"/>
-      <w:pPr>
-        <w:ind w:left="1440" w:hanging="360"/>
-      </w:pPr>
-    </w:lvl>
-    <w:lvl w:ilvl="2" w:tplc="4EF0C656">
-      <w:start w:val="1"/>
-      <w:numFmt w:val="bullet"/>
-      <w:lvlText w:val="■"/>
-      <w:lvlJc w:val="left"/>
-      <w:pPr>
-        <w:ind w:left="2160" w:hanging="360"/>
-      </w:pPr>
-    </w:lvl>
-    <w:lvl w:ilvl="3" w:tplc="7152E232">
-      <w:start w:val="1"/>
-      <w:numFmt w:val="bullet"/>
-      <w:lvlText w:val="●"/>
-      <w:lvlJc w:val="left"/>
-      <w:pPr>
-        <w:ind w:left="2880" w:hanging="360"/>
-      </w:pPr>
-    </w:lvl>
-    <w:lvl w:ilvl="4" w:tplc="2026C1AA">
-      <w:start w:val="1"/>
-      <w:numFmt w:val="bullet"/>
-      <w:lvlText w:val="○"/>
-      <w:lvlJc w:val="left"/>
-      <w:pPr>
-        <w:ind w:left="3600" w:hanging="360"/>
-      </w:pPr>
-    </w:lvl>
-    <w:lvl w:ilvl="5" w:tplc="38CA0578">
-      <w:start w:val="1"/>
-      <w:numFmt w:val="bullet"/>
-      <w:lvlText w:val="■"/>
-      <w:lvlJc w:val="left"/>
-      <w:pPr>
-        <w:ind w:left="4320" w:hanging="360"/>
-      </w:pPr>
-    </w:lvl>
-    <w:lvl w:ilvl="6" w:tplc="14F6939A">
-      <w:start w:val="1"/>
-      <w:numFmt w:val="bullet"/>
-      <w:lvlText w:val="●"/>
-      <w:lvlJc w:val="left"/>
-      <w:pPr>
-        <w:ind w:left="5040" w:hanging="360"/>
-      </w:pPr>
-    </w:lvl>
-    <w:lvl w:ilvl="7" w:tplc="FE603D1E">
-      <w:start w:val="1"/>
-      <w:numFmt w:val="bullet"/>
-      <w:lvlText w:val="●"/>
-      <w:lvlJc w:val="left"/>
-      <w:pPr>
-        <w:ind w:left="5760" w:hanging="360"/>
-      </w:pPr>
-    </w:lvl>
-    <w:lvl w:ilvl="8" w:tplc="164E1C4E">
-      <w:start w:val="1"/>
-      <w:numFmt w:val="bullet"/>
-      <w:lvlText w:val="●"/>
-      <w:lvlJc w:val="left"/>
-      <w:pPr>
-        <w:ind w:left="6480" w:hanging="360"/>
-      </w:pPr>
-    </w:lvl>
-  </w:abstractNum>
-  <w:num w:numId="1" w16cid:durableId="414129140">
-    <w:abstractNumId w:val="1"/>
+  <w:num w:numId="1" w16cid:durableId="224224595">
+    <w:abstractNumId w:val="0"/>
     <w:lvlOverride w:ilvl="0">
       <w:startOverride w:val="1"/>
     </w:lvlOverride>
   </w:num>
-  <w:num w:numId="2" w16cid:durableId="815561599">
-    <w:abstractNumId w:val="0"/>
+  <w:num w:numId="2" w16cid:durableId="640884718">
+    <w:abstractNumId w:val="1"/>
     <w:lvlOverride w:ilvl="0">
       <w:startOverride w:val="1"/>
     </w:lvlOverride>
@@ -11777,7 +11777,7 @@
     <w:autoRedefine/>
     <w:uiPriority w:val="39"/>
     <w:unhideWhenUsed/>
-    <w:rsid w:val="00DA7748"/>
+    <w:rsid w:val="006254E7"/>
     <w:pPr>
       <w:spacing w:after="100"/>
     </w:pPr>
@@ -11789,7 +11789,7 @@
     <w:autoRedefine/>
     <w:uiPriority w:val="39"/>
     <w:unhideWhenUsed/>
-    <w:rsid w:val="00DA7748"/>
+    <w:rsid w:val="006254E7"/>
     <w:pPr>
       <w:spacing w:after="100"/>
       <w:ind w:left="220"/>

</xml_diff>

<commit_message>
Restore report v2; corrected report as v4
</commit_message>
<xml_diff>
--- a/docs/report/PhishLens-theory-report-v2.docx
+++ b/docs/report/PhishLens-theory-report-v2.docx
@@ -102,7 +102,7 @@
       <w:pPr>
         <w:pStyle w:val="Heading1"/>
       </w:pPr>
-      <w:bookmarkStart w:id="0" w:name="_Toc243247730"/>
+      <w:bookmarkStart w:id="0" w:name="_Toc243220041"/>
       <w:r>
         <w:t>Contents</w:t>
       </w:r>
@@ -111,7 +111,7 @@
     <w:sdt>
       <w:sdtPr>
         <w:alias w:val="Contents"/>
-        <w:id w:val="-1106728608"/>
+        <w:id w:val="-673569120"/>
       </w:sdtPr>
       <w:sdtEndPr/>
       <w:sdtContent>
@@ -139,7 +139,7 @@
           <w:r>
             <w:fldChar w:fldCharType="separate"/>
           </w:r>
-          <w:hyperlink w:anchor="_Toc243247730" w:history="1">
+          <w:hyperlink w:anchor="_Toc243220041" w:history="1">
             <w:r>
               <w:rPr>
                 <w:rStyle w:val="Hyperlink"/>
@@ -163,7 +163,7 @@
               <w:rPr>
                 <w:noProof/>
               </w:rPr>
-              <w:instrText xml:space="preserve"> PAGEREF _Toc243247730 \h </w:instrText>
+              <w:instrText xml:space="preserve"> PAGEREF _Toc243220041 \h </w:instrText>
             </w:r>
             <w:r>
               <w:rPr>
@@ -205,7 +205,7 @@
               <w14:ligatures w14:val="standardContextual"/>
             </w:rPr>
           </w:pPr>
-          <w:hyperlink w:anchor="_Toc243247731" w:history="1">
+          <w:hyperlink w:anchor="_Toc243220042" w:history="1">
             <w:r>
               <w:rPr>
                 <w:rStyle w:val="Hyperlink"/>
@@ -229,7 +229,7 @@
               <w:rPr>
                 <w:noProof/>
               </w:rPr>
-              <w:instrText xml:space="preserve"> PAGEREF _Toc243247731 \h </w:instrText>
+              <w:instrText xml:space="preserve"> PAGEREF _Toc243220042 \h </w:instrText>
             </w:r>
             <w:r>
               <w:rPr>
@@ -271,7 +271,7 @@
               <w14:ligatures w14:val="standardContextual"/>
             </w:rPr>
           </w:pPr>
-          <w:hyperlink w:anchor="_Toc243247732" w:history="1">
+          <w:hyperlink w:anchor="_Toc243220043" w:history="1">
             <w:r>
               <w:rPr>
                 <w:rStyle w:val="Hyperlink"/>
@@ -295,7 +295,7 @@
               <w:rPr>
                 <w:noProof/>
               </w:rPr>
-              <w:instrText xml:space="preserve"> PAGEREF _Toc243247732 \h </w:instrText>
+              <w:instrText xml:space="preserve"> PAGEREF _Toc243220043 \h </w:instrText>
             </w:r>
             <w:r>
               <w:rPr>
@@ -337,7 +337,7 @@
               <w14:ligatures w14:val="standardContextual"/>
             </w:rPr>
           </w:pPr>
-          <w:hyperlink w:anchor="_Toc243247733" w:history="1">
+          <w:hyperlink w:anchor="_Toc243220044" w:history="1">
             <w:r>
               <w:rPr>
                 <w:rStyle w:val="Hyperlink"/>
@@ -361,7 +361,7 @@
               <w:rPr>
                 <w:noProof/>
               </w:rPr>
-              <w:instrText xml:space="preserve"> PAGEREF _Toc243247733 \h </w:instrText>
+              <w:instrText xml:space="preserve"> PAGEREF _Toc243220044 \h </w:instrText>
             </w:r>
             <w:r>
               <w:rPr>
@@ -403,7 +403,7 @@
               <w14:ligatures w14:val="standardContextual"/>
             </w:rPr>
           </w:pPr>
-          <w:hyperlink w:anchor="_Toc243247734" w:history="1">
+          <w:hyperlink w:anchor="_Toc243220045" w:history="1">
             <w:r>
               <w:rPr>
                 <w:rStyle w:val="Hyperlink"/>
@@ -427,7 +427,7 @@
               <w:rPr>
                 <w:noProof/>
               </w:rPr>
-              <w:instrText xml:space="preserve"> PAGEREF _Toc243247734 \h </w:instrText>
+              <w:instrText xml:space="preserve"> PAGEREF _Toc243220045 \h </w:instrText>
             </w:r>
             <w:r>
               <w:rPr>
@@ -469,7 +469,7 @@
               <w14:ligatures w14:val="standardContextual"/>
             </w:rPr>
           </w:pPr>
-          <w:hyperlink w:anchor="_Toc243247735" w:history="1">
+          <w:hyperlink w:anchor="_Toc243220046" w:history="1">
             <w:r>
               <w:rPr>
                 <w:rStyle w:val="Hyperlink"/>
@@ -493,7 +493,7 @@
               <w:rPr>
                 <w:noProof/>
               </w:rPr>
-              <w:instrText xml:space="preserve"> PAGEREF _Toc243247735 \h </w:instrText>
+              <w:instrText xml:space="preserve"> PAGEREF _Toc243220046 \h </w:instrText>
             </w:r>
             <w:r>
               <w:rPr>
@@ -535,7 +535,7 @@
               <w14:ligatures w14:val="standardContextual"/>
             </w:rPr>
           </w:pPr>
-          <w:hyperlink w:anchor="_Toc243247736" w:history="1">
+          <w:hyperlink w:anchor="_Toc243220047" w:history="1">
             <w:r>
               <w:rPr>
                 <w:rStyle w:val="Hyperlink"/>
@@ -559,7 +559,7 @@
               <w:rPr>
                 <w:noProof/>
               </w:rPr>
-              <w:instrText xml:space="preserve"> PAGEREF _Toc243247736 \h </w:instrText>
+              <w:instrText xml:space="preserve"> PAGEREF _Toc243220047 \h </w:instrText>
             </w:r>
             <w:r>
               <w:rPr>
@@ -601,7 +601,7 @@
               <w14:ligatures w14:val="standardContextual"/>
             </w:rPr>
           </w:pPr>
-          <w:hyperlink w:anchor="_Toc243247737" w:history="1">
+          <w:hyperlink w:anchor="_Toc243220048" w:history="1">
             <w:r>
               <w:rPr>
                 <w:rStyle w:val="Hyperlink"/>
@@ -625,7 +625,7 @@
               <w:rPr>
                 <w:noProof/>
               </w:rPr>
-              <w:instrText xml:space="preserve"> PAGEREF _Toc243247737 \h </w:instrText>
+              <w:instrText xml:space="preserve"> PAGEREF _Toc243220048 \h </w:instrText>
             </w:r>
             <w:r>
               <w:rPr>
@@ -667,7 +667,7 @@
               <w14:ligatures w14:val="standardContextual"/>
             </w:rPr>
           </w:pPr>
-          <w:hyperlink w:anchor="_Toc243247738" w:history="1">
+          <w:hyperlink w:anchor="_Toc243220049" w:history="1">
             <w:r>
               <w:rPr>
                 <w:rStyle w:val="Hyperlink"/>
@@ -691,7 +691,7 @@
               <w:rPr>
                 <w:noProof/>
               </w:rPr>
-              <w:instrText xml:space="preserve"> PAGEREF _Toc243247738 \h </w:instrText>
+              <w:instrText xml:space="preserve"> PAGEREF _Toc243220049 \h </w:instrText>
             </w:r>
             <w:r>
               <w:rPr>
@@ -733,7 +733,7 @@
               <w14:ligatures w14:val="standardContextual"/>
             </w:rPr>
           </w:pPr>
-          <w:hyperlink w:anchor="_Toc243247739" w:history="1">
+          <w:hyperlink w:anchor="_Toc243220050" w:history="1">
             <w:r>
               <w:rPr>
                 <w:rStyle w:val="Hyperlink"/>
@@ -757,7 +757,7 @@
               <w:rPr>
                 <w:noProof/>
               </w:rPr>
-              <w:instrText xml:space="preserve"> PAGEREF _Toc243247739 \h </w:instrText>
+              <w:instrText xml:space="preserve"> PAGEREF _Toc243220050 \h </w:instrText>
             </w:r>
             <w:r>
               <w:rPr>
@@ -799,7 +799,7 @@
               <w14:ligatures w14:val="standardContextual"/>
             </w:rPr>
           </w:pPr>
-          <w:hyperlink w:anchor="_Toc243247740" w:history="1">
+          <w:hyperlink w:anchor="_Toc243220051" w:history="1">
             <w:r>
               <w:rPr>
                 <w:rStyle w:val="Hyperlink"/>
@@ -823,7 +823,7 @@
               <w:rPr>
                 <w:noProof/>
               </w:rPr>
-              <w:instrText xml:space="preserve"> PAGEREF _Toc243247740 \h </w:instrText>
+              <w:instrText xml:space="preserve"> PAGEREF _Toc243220051 \h </w:instrText>
             </w:r>
             <w:r>
               <w:rPr>
@@ -865,7 +865,7 @@
               <w14:ligatures w14:val="standardContextual"/>
             </w:rPr>
           </w:pPr>
-          <w:hyperlink w:anchor="_Toc243247741" w:history="1">
+          <w:hyperlink w:anchor="_Toc243220052" w:history="1">
             <w:r>
               <w:rPr>
                 <w:rStyle w:val="Hyperlink"/>
@@ -889,7 +889,7 @@
               <w:rPr>
                 <w:noProof/>
               </w:rPr>
-              <w:instrText xml:space="preserve"> PAGEREF _Toc243247741 \h </w:instrText>
+              <w:instrText xml:space="preserve"> PAGEREF _Toc243220052 \h </w:instrText>
             </w:r>
             <w:r>
               <w:rPr>
@@ -931,7 +931,7 @@
               <w14:ligatures w14:val="standardContextual"/>
             </w:rPr>
           </w:pPr>
-          <w:hyperlink w:anchor="_Toc243247742" w:history="1">
+          <w:hyperlink w:anchor="_Toc243220053" w:history="1">
             <w:r>
               <w:rPr>
                 <w:rStyle w:val="Hyperlink"/>
@@ -955,7 +955,7 @@
               <w:rPr>
                 <w:noProof/>
               </w:rPr>
-              <w:instrText xml:space="preserve"> PAGEREF _Toc243247742 \h </w:instrText>
+              <w:instrText xml:space="preserve"> PAGEREF _Toc243220053 \h </w:instrText>
             </w:r>
             <w:r>
               <w:rPr>
@@ -997,7 +997,7 @@
               <w14:ligatures w14:val="standardContextual"/>
             </w:rPr>
           </w:pPr>
-          <w:hyperlink w:anchor="_Toc243247743" w:history="1">
+          <w:hyperlink w:anchor="_Toc243220054" w:history="1">
             <w:r>
               <w:rPr>
                 <w:rStyle w:val="Hyperlink"/>
@@ -1021,7 +1021,7 @@
               <w:rPr>
                 <w:noProof/>
               </w:rPr>
-              <w:instrText xml:space="preserve"> PAGEREF _Toc243247743 \h </w:instrText>
+              <w:instrText xml:space="preserve"> PAGEREF _Toc243220054 \h </w:instrText>
             </w:r>
             <w:r>
               <w:rPr>
@@ -1063,7 +1063,7 @@
               <w14:ligatures w14:val="standardContextual"/>
             </w:rPr>
           </w:pPr>
-          <w:hyperlink w:anchor="_Toc243247744" w:history="1">
+          <w:hyperlink w:anchor="_Toc243220055" w:history="1">
             <w:r>
               <w:rPr>
                 <w:rStyle w:val="Hyperlink"/>
@@ -1087,7 +1087,7 @@
               <w:rPr>
                 <w:noProof/>
               </w:rPr>
-              <w:instrText xml:space="preserve"> PAGEREF _Toc243247744 \h </w:instrText>
+              <w:instrText xml:space="preserve"> PAGEREF _Toc243220055 \h </w:instrText>
             </w:r>
             <w:r>
               <w:rPr>
@@ -1129,7 +1129,7 @@
               <w14:ligatures w14:val="standardContextual"/>
             </w:rPr>
           </w:pPr>
-          <w:hyperlink w:anchor="_Toc243247745" w:history="1">
+          <w:hyperlink w:anchor="_Toc243220056" w:history="1">
             <w:r>
               <w:rPr>
                 <w:rStyle w:val="Hyperlink"/>
@@ -1153,7 +1153,7 @@
               <w:rPr>
                 <w:noProof/>
               </w:rPr>
-              <w:instrText xml:space="preserve"> PAGEREF _Toc243247745 \h </w:instrText>
+              <w:instrText xml:space="preserve"> PAGEREF _Toc243220056 \h </w:instrText>
             </w:r>
             <w:r>
               <w:rPr>
@@ -1195,7 +1195,7 @@
               <w14:ligatures w14:val="standardContextual"/>
             </w:rPr>
           </w:pPr>
-          <w:hyperlink w:anchor="_Toc243247746" w:history="1">
+          <w:hyperlink w:anchor="_Toc243220057" w:history="1">
             <w:r>
               <w:rPr>
                 <w:rStyle w:val="Hyperlink"/>
@@ -1219,7 +1219,7 @@
               <w:rPr>
                 <w:noProof/>
               </w:rPr>
-              <w:instrText xml:space="preserve"> PAGEREF _Toc243247746 \h </w:instrText>
+              <w:instrText xml:space="preserve"> PAGEREF _Toc243220057 \h </w:instrText>
             </w:r>
             <w:r>
               <w:rPr>
@@ -1261,7 +1261,7 @@
               <w14:ligatures w14:val="standardContextual"/>
             </w:rPr>
           </w:pPr>
-          <w:hyperlink w:anchor="_Toc243247747" w:history="1">
+          <w:hyperlink w:anchor="_Toc243220058" w:history="1">
             <w:r>
               <w:rPr>
                 <w:rStyle w:val="Hyperlink"/>
@@ -1285,7 +1285,7 @@
               <w:rPr>
                 <w:noProof/>
               </w:rPr>
-              <w:instrText xml:space="preserve"> PAGEREF _Toc243247747 \h </w:instrText>
+              <w:instrText xml:space="preserve"> PAGEREF _Toc243220058 \h </w:instrText>
             </w:r>
             <w:r>
               <w:rPr>
@@ -1327,7 +1327,7 @@
               <w14:ligatures w14:val="standardContextual"/>
             </w:rPr>
           </w:pPr>
-          <w:hyperlink w:anchor="_Toc243247748" w:history="1">
+          <w:hyperlink w:anchor="_Toc243220059" w:history="1">
             <w:r>
               <w:rPr>
                 <w:rStyle w:val="Hyperlink"/>
@@ -1351,7 +1351,7 @@
               <w:rPr>
                 <w:noProof/>
               </w:rPr>
-              <w:instrText xml:space="preserve"> PAGEREF _Toc243247748 \h </w:instrText>
+              <w:instrText xml:space="preserve"> PAGEREF _Toc243220059 \h </w:instrText>
             </w:r>
             <w:r>
               <w:rPr>
@@ -1393,7 +1393,7 @@
               <w14:ligatures w14:val="standardContextual"/>
             </w:rPr>
           </w:pPr>
-          <w:hyperlink w:anchor="_Toc243247749" w:history="1">
+          <w:hyperlink w:anchor="_Toc243220060" w:history="1">
             <w:r>
               <w:rPr>
                 <w:rStyle w:val="Hyperlink"/>
@@ -1417,7 +1417,7 @@
               <w:rPr>
                 <w:noProof/>
               </w:rPr>
-              <w:instrText xml:space="preserve"> PAGEREF _Toc243247749 \h </w:instrText>
+              <w:instrText xml:space="preserve"> PAGEREF _Toc243220060 \h </w:instrText>
             </w:r>
             <w:r>
               <w:rPr>
@@ -1459,7 +1459,7 @@
               <w14:ligatures w14:val="standardContextual"/>
             </w:rPr>
           </w:pPr>
-          <w:hyperlink w:anchor="_Toc243247750" w:history="1">
+          <w:hyperlink w:anchor="_Toc243220061" w:history="1">
             <w:r>
               <w:rPr>
                 <w:rStyle w:val="Hyperlink"/>
@@ -1483,7 +1483,7 @@
               <w:rPr>
                 <w:noProof/>
               </w:rPr>
-              <w:instrText xml:space="preserve"> PAGEREF _Toc243247750 \h </w:instrText>
+              <w:instrText xml:space="preserve"> PAGEREF _Toc243220061 \h </w:instrText>
             </w:r>
             <w:r>
               <w:rPr>
@@ -1525,7 +1525,7 @@
               <w14:ligatures w14:val="standardContextual"/>
             </w:rPr>
           </w:pPr>
-          <w:hyperlink w:anchor="_Toc243247751" w:history="1">
+          <w:hyperlink w:anchor="_Toc243220062" w:history="1">
             <w:r>
               <w:rPr>
                 <w:rStyle w:val="Hyperlink"/>
@@ -1549,7 +1549,7 @@
               <w:rPr>
                 <w:noProof/>
               </w:rPr>
-              <w:instrText xml:space="preserve"> PAGEREF _Toc243247751 \h </w:instrText>
+              <w:instrText xml:space="preserve"> PAGEREF _Toc243220062 \h </w:instrText>
             </w:r>
             <w:r>
               <w:rPr>
@@ -1591,7 +1591,7 @@
               <w14:ligatures w14:val="standardContextual"/>
             </w:rPr>
           </w:pPr>
-          <w:hyperlink w:anchor="_Toc243247752" w:history="1">
+          <w:hyperlink w:anchor="_Toc243220063" w:history="1">
             <w:r>
               <w:rPr>
                 <w:rStyle w:val="Hyperlink"/>
@@ -1615,7 +1615,7 @@
               <w:rPr>
                 <w:noProof/>
               </w:rPr>
-              <w:instrText xml:space="preserve"> PAGEREF _Toc243247752 \h </w:instrText>
+              <w:instrText xml:space="preserve"> PAGEREF _Toc243220063 \h </w:instrText>
             </w:r>
             <w:r>
               <w:rPr>
@@ -1657,7 +1657,7 @@
               <w14:ligatures w14:val="standardContextual"/>
             </w:rPr>
           </w:pPr>
-          <w:hyperlink w:anchor="_Toc243247753" w:history="1">
+          <w:hyperlink w:anchor="_Toc243220064" w:history="1">
             <w:r>
               <w:rPr>
                 <w:rStyle w:val="Hyperlink"/>
@@ -1681,7 +1681,7 @@
               <w:rPr>
                 <w:noProof/>
               </w:rPr>
-              <w:instrText xml:space="preserve"> PAGEREF _Toc243247753 \h </w:instrText>
+              <w:instrText xml:space="preserve"> PAGEREF _Toc243220064 \h </w:instrText>
             </w:r>
             <w:r>
               <w:rPr>
@@ -1723,7 +1723,7 @@
               <w14:ligatures w14:val="standardContextual"/>
             </w:rPr>
           </w:pPr>
-          <w:hyperlink w:anchor="_Toc243247754" w:history="1">
+          <w:hyperlink w:anchor="_Toc243220065" w:history="1">
             <w:r>
               <w:rPr>
                 <w:rStyle w:val="Hyperlink"/>
@@ -1747,7 +1747,7 @@
               <w:rPr>
                 <w:noProof/>
               </w:rPr>
-              <w:instrText xml:space="preserve"> PAGEREF _Toc243247754 \h </w:instrText>
+              <w:instrText xml:space="preserve"> PAGEREF _Toc243220065 \h </w:instrText>
             </w:r>
             <w:r>
               <w:rPr>
@@ -1789,7 +1789,7 @@
               <w14:ligatures w14:val="standardContextual"/>
             </w:rPr>
           </w:pPr>
-          <w:hyperlink w:anchor="_Toc243247755" w:history="1">
+          <w:hyperlink w:anchor="_Toc243220066" w:history="1">
             <w:r>
               <w:rPr>
                 <w:rStyle w:val="Hyperlink"/>
@@ -1813,7 +1813,7 @@
               <w:rPr>
                 <w:noProof/>
               </w:rPr>
-              <w:instrText xml:space="preserve"> PAGEREF _Toc243247755 \h </w:instrText>
+              <w:instrText xml:space="preserve"> PAGEREF _Toc243220066 \h </w:instrText>
             </w:r>
             <w:r>
               <w:rPr>
@@ -1855,7 +1855,7 @@
               <w14:ligatures w14:val="standardContextual"/>
             </w:rPr>
           </w:pPr>
-          <w:hyperlink w:anchor="_Toc243247756" w:history="1">
+          <w:hyperlink w:anchor="_Toc243220067" w:history="1">
             <w:r>
               <w:rPr>
                 <w:rStyle w:val="Hyperlink"/>
@@ -1879,7 +1879,7 @@
               <w:rPr>
                 <w:noProof/>
               </w:rPr>
-              <w:instrText xml:space="preserve"> PAGEREF _Toc243247756 \h </w:instrText>
+              <w:instrText xml:space="preserve"> PAGEREF _Toc243220067 \h </w:instrText>
             </w:r>
             <w:r>
               <w:rPr>
@@ -1921,7 +1921,7 @@
               <w14:ligatures w14:val="standardContextual"/>
             </w:rPr>
           </w:pPr>
-          <w:hyperlink w:anchor="_Toc243247757" w:history="1">
+          <w:hyperlink w:anchor="_Toc243220068" w:history="1">
             <w:r>
               <w:rPr>
                 <w:rStyle w:val="Hyperlink"/>
@@ -1945,7 +1945,7 @@
               <w:rPr>
                 <w:noProof/>
               </w:rPr>
-              <w:instrText xml:space="preserve"> PAGEREF _Toc243247757 \h </w:instrText>
+              <w:instrText xml:space="preserve"> PAGEREF _Toc243220068 \h </w:instrText>
             </w:r>
             <w:r>
               <w:rPr>
@@ -1987,7 +1987,7 @@
               <w14:ligatures w14:val="standardContextual"/>
             </w:rPr>
           </w:pPr>
-          <w:hyperlink w:anchor="_Toc243247758" w:history="1">
+          <w:hyperlink w:anchor="_Toc243220069" w:history="1">
             <w:r>
               <w:rPr>
                 <w:rStyle w:val="Hyperlink"/>
@@ -2011,7 +2011,7 @@
               <w:rPr>
                 <w:noProof/>
               </w:rPr>
-              <w:instrText xml:space="preserve"> PAGEREF _Toc243247758 \h </w:instrText>
+              <w:instrText xml:space="preserve"> PAGEREF _Toc243220069 \h </w:instrText>
             </w:r>
             <w:r>
               <w:rPr>
@@ -2053,7 +2053,7 @@
               <w14:ligatures w14:val="standardContextual"/>
             </w:rPr>
           </w:pPr>
-          <w:hyperlink w:anchor="_Toc243247759" w:history="1">
+          <w:hyperlink w:anchor="_Toc243220070" w:history="1">
             <w:r>
               <w:rPr>
                 <w:rStyle w:val="Hyperlink"/>
@@ -2077,7 +2077,7 @@
               <w:rPr>
                 <w:noProof/>
               </w:rPr>
-              <w:instrText xml:space="preserve"> PAGEREF _Toc243247759 \h </w:instrText>
+              <w:instrText xml:space="preserve"> PAGEREF _Toc243220070 \h </w:instrText>
             </w:r>
             <w:r>
               <w:rPr>
@@ -2119,7 +2119,7 @@
               <w14:ligatures w14:val="standardContextual"/>
             </w:rPr>
           </w:pPr>
-          <w:hyperlink w:anchor="_Toc243247760" w:history="1">
+          <w:hyperlink w:anchor="_Toc243220071" w:history="1">
             <w:r>
               <w:rPr>
                 <w:rStyle w:val="Hyperlink"/>
@@ -2143,7 +2143,7 @@
               <w:rPr>
                 <w:noProof/>
               </w:rPr>
-              <w:instrText xml:space="preserve"> PAGEREF _Toc243247760 \h </w:instrText>
+              <w:instrText xml:space="preserve"> PAGEREF _Toc243220071 \h </w:instrText>
             </w:r>
             <w:r>
               <w:rPr>
@@ -2185,7 +2185,7 @@
               <w14:ligatures w14:val="standardContextual"/>
             </w:rPr>
           </w:pPr>
-          <w:hyperlink w:anchor="_Toc243247761" w:history="1">
+          <w:hyperlink w:anchor="_Toc243220072" w:history="1">
             <w:r>
               <w:rPr>
                 <w:rStyle w:val="Hyperlink"/>
@@ -2209,7 +2209,7 @@
               <w:rPr>
                 <w:noProof/>
               </w:rPr>
-              <w:instrText xml:space="preserve"> PAGEREF _Toc243247761 \h </w:instrText>
+              <w:instrText xml:space="preserve"> PAGEREF _Toc243220072 \h </w:instrText>
             </w:r>
             <w:r>
               <w:rPr>
@@ -2251,7 +2251,7 @@
               <w14:ligatures w14:val="standardContextual"/>
             </w:rPr>
           </w:pPr>
-          <w:hyperlink w:anchor="_Toc243247762" w:history="1">
+          <w:hyperlink w:anchor="_Toc243220073" w:history="1">
             <w:r>
               <w:rPr>
                 <w:rStyle w:val="Hyperlink"/>
@@ -2275,7 +2275,7 @@
               <w:rPr>
                 <w:noProof/>
               </w:rPr>
-              <w:instrText xml:space="preserve"> PAGEREF _Toc243247762 \h </w:instrText>
+              <w:instrText xml:space="preserve"> PAGEREF _Toc243220073 \h </w:instrText>
             </w:r>
             <w:r>
               <w:rPr>
@@ -2317,7 +2317,7 @@
               <w14:ligatures w14:val="standardContextual"/>
             </w:rPr>
           </w:pPr>
-          <w:hyperlink w:anchor="_Toc243247763" w:history="1">
+          <w:hyperlink w:anchor="_Toc243220074" w:history="1">
             <w:r>
               <w:rPr>
                 <w:rStyle w:val="Hyperlink"/>
@@ -2341,7 +2341,7 @@
               <w:rPr>
                 <w:noProof/>
               </w:rPr>
-              <w:instrText xml:space="preserve"> PAGEREF _Toc243247763 \h </w:instrText>
+              <w:instrText xml:space="preserve"> PAGEREF _Toc243220074 \h </w:instrText>
             </w:r>
             <w:r>
               <w:rPr>
@@ -2383,7 +2383,7 @@
               <w14:ligatures w14:val="standardContextual"/>
             </w:rPr>
           </w:pPr>
-          <w:hyperlink w:anchor="_Toc243247764" w:history="1">
+          <w:hyperlink w:anchor="_Toc243220075" w:history="1">
             <w:r>
               <w:rPr>
                 <w:rStyle w:val="Hyperlink"/>
@@ -2407,7 +2407,7 @@
               <w:rPr>
                 <w:noProof/>
               </w:rPr>
-              <w:instrText xml:space="preserve"> PAGEREF _Toc243247764 \h </w:instrText>
+              <w:instrText xml:space="preserve"> PAGEREF _Toc243220075 \h </w:instrText>
             </w:r>
             <w:r>
               <w:rPr>
@@ -2449,7 +2449,7 @@
               <w14:ligatures w14:val="standardContextual"/>
             </w:rPr>
           </w:pPr>
-          <w:hyperlink w:anchor="_Toc243247765" w:history="1">
+          <w:hyperlink w:anchor="_Toc243220076" w:history="1">
             <w:r>
               <w:rPr>
                 <w:rStyle w:val="Hyperlink"/>
@@ -2473,7 +2473,7 @@
               <w:rPr>
                 <w:noProof/>
               </w:rPr>
-              <w:instrText xml:space="preserve"> PAGEREF _Toc243247765 \h </w:instrText>
+              <w:instrText xml:space="preserve"> PAGEREF _Toc243220076 \h </w:instrText>
             </w:r>
             <w:r>
               <w:rPr>
@@ -2515,7 +2515,7 @@
               <w14:ligatures w14:val="standardContextual"/>
             </w:rPr>
           </w:pPr>
-          <w:hyperlink w:anchor="_Toc243247766" w:history="1">
+          <w:hyperlink w:anchor="_Toc243220077" w:history="1">
             <w:r>
               <w:rPr>
                 <w:rStyle w:val="Hyperlink"/>
@@ -2539,7 +2539,7 @@
               <w:rPr>
                 <w:noProof/>
               </w:rPr>
-              <w:instrText xml:space="preserve"> PAGEREF _Toc243247766 \h </w:instrText>
+              <w:instrText xml:space="preserve"> PAGEREF _Toc243220077 \h </w:instrText>
             </w:r>
             <w:r>
               <w:rPr>
@@ -2582,7 +2582,7 @@
       <w:pPr>
         <w:pStyle w:val="Heading1"/>
       </w:pPr>
-      <w:bookmarkStart w:id="1" w:name="_Toc243247731"/>
+      <w:bookmarkStart w:id="1" w:name="_Toc243220042"/>
       <w:r>
         <w:t>1. Model scenario</w:t>
       </w:r>
@@ -2592,7 +2592,7 @@
       <w:pPr>
         <w:pStyle w:val="Heading2"/>
       </w:pPr>
-      <w:bookmarkStart w:id="2" w:name="_Toc243247732"/>
+      <w:bookmarkStart w:id="2" w:name="_Toc243220043"/>
       <w:r>
         <w:t>The operational setting</w:t>
       </w:r>
@@ -2621,7 +2621,7 @@
       <w:pPr>
         <w:pStyle w:val="Heading2"/>
       </w:pPr>
-      <w:bookmarkStart w:id="3" w:name="_Toc243247733"/>
+      <w:bookmarkStart w:id="3" w:name="_Toc243220044"/>
       <w:r>
         <w:t>Why a learned model rather than rules</w:t>
       </w:r>
@@ -2642,7 +2642,7 @@
       <w:pPr>
         <w:pStyle w:val="Heading2"/>
       </w:pPr>
-      <w:bookmarkStart w:id="4" w:name="_Toc243247734"/>
+      <w:bookmarkStart w:id="4" w:name="_Toc243220045"/>
       <w:r>
         <w:t>Why text alone is a deliberate constraint</w:t>
       </w:r>
@@ -2656,14 +2656,14 @@
         <w:t>The model reads subject and body text only. Sender domain, header residue, URL counts and routing metadata are excluded by design, although the raw corpora carry them. Those fields are the strongest predictors available on this data and excluding them lowers the headline score, which is the point. Header and domain features on a pooled research corpus encode which archive a message was drawn from at least as much as they encode phishing, and a model permitted to use them can score well without learning anyt</w:t>
       </w:r>
       <w:r>
-        <w:t>hing about phishing language at all. Section 3 measures how much of that artefact survives even under the text-only constraint. Restricting the input is what makes the resulting claim about phishing language an honest one, and it is also what makes the token-level explanation meaningful to an analyst: highlighted words in the message body are something a person can judge, whereas a weight on a header field is not.</w:t>
+        <w:t>hing about phishing language at all. Section 3 measures how much of that artefact survives even under the text- only constraint. Restricting the input is what makes the resulting claim about phishing language an honest one, and it is also what makes the token-level explanation meaningful to an analyst: highlighted words in the message body are something a person can judge, whereas a weight on a header field is not.</w:t>
       </w:r>
     </w:p>
     <w:p>
       <w:pPr>
         <w:pStyle w:val="Heading2"/>
       </w:pPr>
-      <w:bookmarkStart w:id="5" w:name="_Toc243247735"/>
+      <w:bookmarkStart w:id="5" w:name="_Toc243220046"/>
       <w:r>
         <w:t>What the model is not</w:t>
       </w:r>
@@ -2710,7 +2710,7 @@
       <w:pPr>
         <w:pStyle w:val="Heading1"/>
       </w:pPr>
-      <w:bookmarkStart w:id="6" w:name="_Toc243247736"/>
+      <w:bookmarkStart w:id="6" w:name="_Toc243220047"/>
       <w:r>
         <w:t>2. Model architecture</w:t>
       </w:r>
@@ -2761,7 +2761,7 @@
       <w:pPr>
         <w:pStyle w:val="Heading2"/>
       </w:pPr>
-      <w:bookmarkStart w:id="7" w:name="_Toc243247737"/>
+      <w:bookmarkStart w:id="7" w:name="_Toc243220048"/>
       <w:r>
         <w:t>2.1 Input representation</w:t>
       </w:r>
@@ -2839,7 +2839,7 @@
       <w:pPr>
         <w:pStyle w:val="Heading2"/>
       </w:pPr>
-      <w:bookmarkStart w:id="8" w:name="_Toc243247738"/>
+      <w:bookmarkStart w:id="8" w:name="_Toc243220049"/>
       <w:r>
         <w:t>2.2 Layers</w:t>
       </w:r>
@@ -3627,7 +3627,7 @@
       <w:pPr>
         <w:pStyle w:val="Heading2"/>
       </w:pPr>
-      <w:bookmarkStart w:id="9" w:name="_Toc243247739"/>
+      <w:bookmarkStart w:id="9" w:name="_Toc243220050"/>
       <w:r>
         <w:t>2.3 Class weighting</w:t>
       </w:r>
@@ -3648,7 +3648,7 @@
       <w:pPr>
         <w:pStyle w:val="Heading2"/>
       </w:pPr>
-      <w:bookmarkStart w:id="10" w:name="_Toc243247740"/>
+      <w:bookmarkStart w:id="10" w:name="_Toc243220051"/>
       <w:r>
         <w:t>2.4 Training loop, patience and best-weight restore</w:t>
       </w:r>
@@ -3761,7 +3761,7 @@
         <w:spacing w:after="160"/>
       </w:pPr>
       <w:r>
-        <w:t>This restore is the guarantee behind every number in section 3. Training ran for six epochs and the best validation macro-F1 was reached at epoch 6 (0.98665, against 0.98624 at epoch 4). The reported test metrics come from the restored best epoch, not from whichever epoch training happened to end on. Reporting last-epoch numbers after early stopping is a common and silent error: it reports a model that was deliberately rejected.</w:t>
+        <w:t>This restore is the guarantee behind every number in section 3. Training ran for six epochs and the best validation macro-F1 was reached at epoch 6 (0.98665, against 0.98624 at epoch 4). The reported test metrics come from the restored best epoch, not from whichever epoch training happened to end on. Reporting last- epoch numbers after early stopping is a common and silent error: it reports a model that was deliberately rejected.</w:t>
       </w:r>
     </w:p>
     <w:p>
@@ -3776,7 +3776,7 @@
       <w:pPr>
         <w:pStyle w:val="Heading2"/>
       </w:pPr>
-      <w:bookmarkStart w:id="11" w:name="_Toc243247741"/>
+      <w:bookmarkStart w:id="11" w:name="_Toc243220052"/>
       <w:r>
         <w:t>2.5 Why this architecture rather than an LSTM or a transformer</w:t>
       </w:r>
@@ -3815,7 +3815,7 @@
       <w:pPr>
         <w:pStyle w:val="Heading2"/>
       </w:pPr>
-      <w:bookmarkStart w:id="12" w:name="_Toc243247742"/>
+      <w:bookmarkStart w:id="12" w:name="_Toc243220053"/>
       <w:r>
         <w:t>References cited in this section</w:t>
       </w:r>
@@ -3866,7 +3866,7 @@
       <w:pPr>
         <w:pStyle w:val="Heading1"/>
       </w:pPr>
-      <w:bookmarkStart w:id="13" w:name="_Toc243247743"/>
+      <w:bookmarkStart w:id="13" w:name="_Toc243220054"/>
       <w:r>
         <w:t>3. Model result analysis</w:t>
       </w:r>
@@ -3895,7 +3895,7 @@
       <w:pPr>
         <w:pStyle w:val="Heading2"/>
       </w:pPr>
-      <w:bookmarkStart w:id="14" w:name="_Toc243247744"/>
+      <w:bookmarkStart w:id="14" w:name="_Toc243220055"/>
       <w:r>
         <w:t>3.1 Headline results on the random split</w:t>
       </w:r>
@@ -5271,7 +5271,7 @@
           <w:noProof/>
         </w:rPr>
         <w:drawing>
-          <wp:inline distT="0" distB="0" distL="0" distR="0" wp14:anchorId="35BBF74C" wp14:editId="070AF1C9">
+          <wp:inline distT="0" distB="0" distL="0" distR="0" wp14:anchorId="2DDCB563" wp14:editId="072768A4">
             <wp:extent cx="4095750" cy="4152900"/>
             <wp:effectExtent l="0" t="0" r="0" b="0"/>
             <wp:docPr id="1" name="Picture 1"/>
@@ -5336,10 +5336,10 @@
           <w:noProof/>
         </w:rPr>
         <w:drawing>
-          <wp:inline distT="0" distB="0" distL="0" distR="0" wp14:anchorId="49EA50F5" wp14:editId="3D30B5E6">
+          <wp:inline distT="0" distB="0" distL="0" distR="0" wp14:anchorId="0DE60E9C" wp14:editId="4DCB1E89">
             <wp:extent cx="4095750" cy="4152900"/>
             <wp:effectExtent l="0" t="0" r="0" b="0"/>
-            <wp:docPr id="771579726" name="Picture 771579726"/>
+            <wp:docPr id="1684134740" name="Picture 1684134740"/>
             <wp:cNvGraphicFramePr>
               <a:graphicFrameLocks xmlns:a="http://schemas.openxmlformats.org/drawingml/2006/main" noChangeAspect="1"/>
             </wp:cNvGraphicFramePr>
@@ -5401,10 +5401,10 @@
           <w:noProof/>
         </w:rPr>
         <w:drawing>
-          <wp:inline distT="0" distB="0" distL="0" distR="0" wp14:anchorId="10BF0BCE" wp14:editId="0C3489BF">
+          <wp:inline distT="0" distB="0" distL="0" distR="0" wp14:anchorId="045F3987" wp14:editId="542E95A8">
             <wp:extent cx="4095750" cy="3371850"/>
             <wp:effectExtent l="0" t="0" r="0" b="0"/>
-            <wp:docPr id="1586780035" name="Picture 1586780035"/>
+            <wp:docPr id="274852963" name="Picture 274852963"/>
             <wp:cNvGraphicFramePr>
               <a:graphicFrameLocks xmlns:a="http://schemas.openxmlformats.org/drawingml/2006/main" noChangeAspect="1"/>
             </wp:cNvGraphicFramePr>
@@ -5466,10 +5466,10 @@
           <w:noProof/>
         </w:rPr>
         <w:drawing>
-          <wp:inline distT="0" distB="0" distL="0" distR="0" wp14:anchorId="569528CC" wp14:editId="334AEDBB">
+          <wp:inline distT="0" distB="0" distL="0" distR="0" wp14:anchorId="1A302EEB" wp14:editId="45849B87">
             <wp:extent cx="4095750" cy="3400425"/>
             <wp:effectExtent l="0" t="0" r="0" b="0"/>
-            <wp:docPr id="1160718848" name="Picture 1160718848"/>
+            <wp:docPr id="882905370" name="Picture 882905370"/>
             <wp:cNvGraphicFramePr>
               <a:graphicFrameLocks xmlns:a="http://schemas.openxmlformats.org/drawingml/2006/main" noChangeAspect="1"/>
             </wp:cNvGraphicFramePr>
@@ -5540,7 +5540,7 @@
       <w:pPr>
         <w:pStyle w:val="Heading2"/>
       </w:pPr>
-      <w:bookmarkStart w:id="15" w:name="_Toc243247745"/>
+      <w:bookmarkStart w:id="15" w:name="_Toc243220056"/>
       <w:r>
         <w:t>3.2 Training behaviour and early stopping</w:t>
       </w:r>
@@ -6473,7 +6473,7 @@
       <w:pPr>
         <w:pStyle w:val="Heading2"/>
       </w:pPr>
-      <w:bookmarkStart w:id="16" w:name="_Toc243247746"/>
+      <w:bookmarkStart w:id="16" w:name="_Toc243220057"/>
       <w:r>
         <w:t>3.3 The corpus probe: what the headline number partly measures</w:t>
       </w:r>
@@ -7033,7 +7033,7 @@
       <w:pPr>
         <w:pStyle w:val="Heading2"/>
       </w:pPr>
-      <w:bookmarkStart w:id="17" w:name="_Toc243247747"/>
+      <w:bookmarkStart w:id="17" w:name="_Toc243220058"/>
       <w:r>
         <w:t>3.4 Leave-one-corpus-out evaluation</w:t>
       </w:r>
@@ -8750,7 +8750,7 @@
       <w:pPr>
         <w:pStyle w:val="Heading2"/>
       </w:pPr>
-      <w:bookmarkStart w:id="18" w:name="_Toc243247748"/>
+      <w:bookmarkStart w:id="18" w:name="_Toc243220059"/>
       <w:r>
         <w:t>3.5 False positives and what the explanations reveal</w:t>
       </w:r>
@@ -8797,10 +8797,10 @@
           <w:noProof/>
         </w:rPr>
         <w:drawing>
-          <wp:inline distT="0" distB="0" distL="0" distR="0" wp14:anchorId="5C8EEDAF" wp14:editId="724128BD">
+          <wp:inline distT="0" distB="0" distL="0" distR="0" wp14:anchorId="0B4F5FB1" wp14:editId="7F16AE03">
             <wp:extent cx="4095750" cy="4095750"/>
             <wp:effectExtent l="0" t="0" r="0" b="0"/>
-            <wp:docPr id="1655426161" name="Picture 1655426161"/>
+            <wp:docPr id="521533158" name="Picture 521533158"/>
             <wp:cNvGraphicFramePr>
               <a:graphicFrameLocks xmlns:a="http://schemas.openxmlformats.org/drawingml/2006/main" noChangeAspect="1"/>
             </wp:cNvGraphicFramePr>
@@ -9007,10 +9007,10 @@
           <w:noProof/>
         </w:rPr>
         <w:drawing>
-          <wp:inline distT="0" distB="0" distL="0" distR="0" wp14:anchorId="48C4D684" wp14:editId="42666988">
+          <wp:inline distT="0" distB="0" distL="0" distR="0" wp14:anchorId="241EA972" wp14:editId="475733BC">
             <wp:extent cx="4095750" cy="3362325"/>
             <wp:effectExtent l="0" t="0" r="0" b="0"/>
-            <wp:docPr id="910886813" name="Picture 910886813"/>
+            <wp:docPr id="991722006" name="Picture 991722006"/>
             <wp:cNvGraphicFramePr>
               <a:graphicFrameLocks xmlns:a="http://schemas.openxmlformats.org/drawingml/2006/main" noChangeAspect="1"/>
             </wp:cNvGraphicFramePr>
@@ -9206,7 +9206,7 @@
       <w:pPr>
         <w:pStyle w:val="Heading2"/>
       </w:pPr>
-      <w:bookmarkStart w:id="19" w:name="_Toc243247749"/>
+      <w:bookmarkStart w:id="19" w:name="_Toc243220060"/>
       <w:r>
         <w:t>3.6 Verdict: is the model effective?</w:t>
       </w:r>
@@ -9255,7 +9255,7 @@
       <w:pPr>
         <w:pStyle w:val="Heading2"/>
       </w:pPr>
-      <w:bookmarkStart w:id="20" w:name="_Toc243247750"/>
+      <w:bookmarkStart w:id="20" w:name="_Toc243220061"/>
       <w:r>
         <w:t>References cited in this section</w:t>
       </w:r>
@@ -9352,7 +9352,7 @@
       <w:pPr>
         <w:pStyle w:val="Heading1"/>
       </w:pPr>
-      <w:bookmarkStart w:id="21" w:name="_Toc243247751"/>
+      <w:bookmarkStart w:id="21" w:name="_Toc243220062"/>
       <w:r>
         <w:t>4. Real-world use of machine learning in cybersecurity</w:t>
       </w:r>
@@ -9362,7 +9362,7 @@
       <w:pPr>
         <w:pStyle w:val="Heading2"/>
       </w:pPr>
-      <w:bookmarkStart w:id="22" w:name="_Toc243247752"/>
+      <w:bookmarkStart w:id="22" w:name="_Toc243220063"/>
       <w:r>
         <w:t>4.1 The four application areas</w:t>
       </w:r>
@@ -9444,7 +9444,7 @@
       <w:pPr>
         <w:pStyle w:val="Heading2"/>
       </w:pPr>
-      <w:bookmarkStart w:id="23" w:name="_Toc243247753"/>
+      <w:bookmarkStart w:id="23" w:name="_Toc243220064"/>
       <w:r>
         <w:t>4.2 Data quality</w:t>
       </w:r>
@@ -9481,7 +9481,7 @@
       <w:pPr>
         <w:pStyle w:val="Heading2"/>
       </w:pPr>
-      <w:bookmarkStart w:id="24" w:name="_Toc243247754"/>
+      <w:bookmarkStart w:id="24" w:name="_Toc243220065"/>
       <w:r>
         <w:t>4.3 Concept drift</w:t>
       </w:r>
@@ -9538,7 +9538,7 @@
       <w:pPr>
         <w:pStyle w:val="Heading2"/>
       </w:pPr>
-      <w:bookmarkStart w:id="25" w:name="_Toc243247755"/>
+      <w:bookmarkStart w:id="25" w:name="_Toc243220066"/>
       <w:r>
         <w:t>4.4 False positives and the alert budget</w:t>
       </w:r>
@@ -9603,7 +9603,7 @@
       <w:pPr>
         <w:pStyle w:val="Heading2"/>
       </w:pPr>
-      <w:bookmarkStart w:id="26" w:name="_Toc243247756"/>
+      <w:bookmarkStart w:id="26" w:name="_Toc243220067"/>
       <w:r>
         <w:t>4.5 The research-to-deployment gap</w:t>
       </w:r>
@@ -9657,7 +9657,7 @@
       <w:pPr>
         <w:pStyle w:val="Heading2"/>
       </w:pPr>
-      <w:bookmarkStart w:id="27" w:name="_Toc243247757"/>
+      <w:bookmarkStart w:id="27" w:name="_Toc243220068"/>
       <w:r>
         <w:t>4.6 What this project's results imply for deploying its own model</w:t>
       </w:r>
@@ -9702,7 +9702,7 @@
       <w:pPr>
         <w:pStyle w:val="Heading2"/>
       </w:pPr>
-      <w:bookmarkStart w:id="28" w:name="_Toc243247758"/>
+      <w:bookmarkStart w:id="28" w:name="_Toc243220069"/>
       <w:r>
         <w:t>References cited in this section</w:t>
       </w:r>
@@ -9799,7 +9799,7 @@
       <w:pPr>
         <w:pStyle w:val="Heading1"/>
       </w:pPr>
-      <w:bookmarkStart w:id="29" w:name="_Toc243247759"/>
+      <w:bookmarkStart w:id="29" w:name="_Toc243220070"/>
       <w:r>
         <w:t>5. System implementation and deployment</w:t>
       </w:r>
@@ -9817,7 +9817,7 @@
       <w:pPr>
         <w:pStyle w:val="Heading2"/>
       </w:pPr>
-      <w:bookmarkStart w:id="30" w:name="_Toc243247760"/>
+      <w:bookmarkStart w:id="30" w:name="_Toc243220071"/>
       <w:r>
         <w:t>5.1 Architecture</w:t>
       </w:r>
@@ -10053,7 +10053,7 @@
       <w:pPr>
         <w:pStyle w:val="Heading2"/>
       </w:pPr>
-      <w:bookmarkStart w:id="31" w:name="_Toc243247761"/>
+      <w:bookmarkStart w:id="31" w:name="_Toc243220072"/>
       <w:r>
         <w:t>5.2 Three clients</w:t>
       </w:r>
@@ -10129,10 +10129,10 @@
           <w:noProof/>
         </w:rPr>
         <w:drawing>
-          <wp:inline distT="0" distB="0" distL="0" distR="0" wp14:anchorId="6DEB6F9A" wp14:editId="7C25680B">
+          <wp:inline distT="0" distB="0" distL="0" distR="0" wp14:anchorId="77688B69" wp14:editId="00B92C5E">
             <wp:extent cx="4095750" cy="3952875"/>
             <wp:effectExtent l="0" t="0" r="0" b="0"/>
-            <wp:docPr id="851483228" name="Picture 851483228"/>
+            <wp:docPr id="1682221621" name="Picture 1682221621"/>
             <wp:cNvGraphicFramePr>
               <a:graphicFrameLocks xmlns:a="http://schemas.openxmlformats.org/drawingml/2006/main" noChangeAspect="1"/>
             </wp:cNvGraphicFramePr>
@@ -10194,10 +10194,10 @@
           <w:noProof/>
         </w:rPr>
         <w:drawing>
-          <wp:inline distT="0" distB="0" distL="0" distR="0" wp14:anchorId="42156D00" wp14:editId="4B036E58">
+          <wp:inline distT="0" distB="0" distL="0" distR="0" wp14:anchorId="5AE7B0F1" wp14:editId="057C007F">
             <wp:extent cx="4095750" cy="3724275"/>
             <wp:effectExtent l="0" t="0" r="0" b="0"/>
-            <wp:docPr id="944865713" name="Picture 944865713"/>
+            <wp:docPr id="361290978" name="Picture 361290978"/>
             <wp:cNvGraphicFramePr>
               <a:graphicFrameLocks xmlns:a="http://schemas.openxmlformats.org/drawingml/2006/main" noChangeAspect="1"/>
             </wp:cNvGraphicFramePr>
@@ -10296,10 +10296,10 @@
           <w:noProof/>
         </w:rPr>
         <w:drawing>
-          <wp:inline distT="0" distB="0" distL="0" distR="0" wp14:anchorId="5DACFB89" wp14:editId="503AA13E">
+          <wp:inline distT="0" distB="0" distL="0" distR="0" wp14:anchorId="012BB925" wp14:editId="056A6BFB">
             <wp:extent cx="4095750" cy="2638425"/>
             <wp:effectExtent l="0" t="0" r="0" b="0"/>
-            <wp:docPr id="808505802" name="Picture 808505802"/>
+            <wp:docPr id="1203210869" name="Picture 1203210869"/>
             <wp:cNvGraphicFramePr>
               <a:graphicFrameLocks xmlns:a="http://schemas.openxmlformats.org/drawingml/2006/main" noChangeAspect="1"/>
             </wp:cNvGraphicFramePr>
@@ -10409,10 +10409,10 @@
           <w:noProof/>
         </w:rPr>
         <w:drawing>
-          <wp:inline distT="0" distB="0" distL="0" distR="0" wp14:anchorId="7448A5A1" wp14:editId="22071716">
+          <wp:inline distT="0" distB="0" distL="0" distR="0" wp14:anchorId="5EBD1DC0" wp14:editId="182B427A">
             <wp:extent cx="4095750" cy="2476500"/>
             <wp:effectExtent l="0" t="0" r="0" b="0"/>
-            <wp:docPr id="1792241273" name="Picture 1792241273"/>
+            <wp:docPr id="110208584" name="Picture 110208584"/>
             <wp:cNvGraphicFramePr>
               <a:graphicFrameLocks xmlns:a="http://schemas.openxmlformats.org/drawingml/2006/main" noChangeAspect="1"/>
             </wp:cNvGraphicFramePr>
@@ -10475,7 +10475,7 @@
       <w:pPr>
         <w:pStyle w:val="Heading2"/>
       </w:pPr>
-      <w:bookmarkStart w:id="32" w:name="_Toc243247762"/>
+      <w:bookmarkStart w:id="32" w:name="_Toc243220073"/>
       <w:r>
         <w:t>5.3 Hosting</w:t>
       </w:r>
@@ -10536,10 +10536,10 @@
           <w:noProof/>
         </w:rPr>
         <w:drawing>
-          <wp:inline distT="0" distB="0" distL="0" distR="0" wp14:anchorId="050D7BBD" wp14:editId="7150C5D8">
+          <wp:inline distT="0" distB="0" distL="0" distR="0" wp14:anchorId="4EA1EFE0" wp14:editId="357C4F00">
             <wp:extent cx="4095750" cy="3448050"/>
             <wp:effectExtent l="0" t="0" r="0" b="0"/>
-            <wp:docPr id="1701749273" name="Picture 1701749273"/>
+            <wp:docPr id="607676458" name="Picture 607676458"/>
             <wp:cNvGraphicFramePr>
               <a:graphicFrameLocks xmlns:a="http://schemas.openxmlformats.org/drawingml/2006/main" noChangeAspect="1"/>
             </wp:cNvGraphicFramePr>
@@ -10605,7 +10605,7 @@
       <w:pPr>
         <w:pStyle w:val="Heading2"/>
       </w:pPr>
-      <w:bookmarkStart w:id="33" w:name="_Toc243247763"/>
+      <w:bookmarkStart w:id="33" w:name="_Toc243220074"/>
       <w:r>
         <w:t>5.4 Security</w:t>
       </w:r>
@@ -10800,7 +10800,7 @@
       <w:pPr>
         <w:pStyle w:val="Heading2"/>
       </w:pPr>
-      <w:bookmarkStart w:id="34" w:name="_Toc243247764"/>
+      <w:bookmarkStart w:id="34" w:name="_Toc243220075"/>
       <w:r>
         <w:t>5.5 Testing and reproducibility</w:t>
       </w:r>
@@ -10828,10 +10828,10 @@
           <w:noProof/>
         </w:rPr>
         <w:drawing>
-          <wp:inline distT="0" distB="0" distL="0" distR="0" wp14:anchorId="42C2D48C" wp14:editId="4760DA0C">
+          <wp:inline distT="0" distB="0" distL="0" distR="0" wp14:anchorId="7CEF78AE" wp14:editId="09F5A892">
             <wp:extent cx="4095750" cy="1800225"/>
             <wp:effectExtent l="0" t="0" r="0" b="0"/>
-            <wp:docPr id="979263482" name="Picture 979263482"/>
+            <wp:docPr id="1567990026" name="Picture 1567990026"/>
             <wp:cNvGraphicFramePr>
               <a:graphicFrameLocks xmlns:a="http://schemas.openxmlformats.org/drawingml/2006/main" noChangeAspect="1"/>
             </wp:cNvGraphicFramePr>
@@ -10894,7 +10894,7 @@
       <w:pPr>
         <w:pStyle w:val="Heading2"/>
       </w:pPr>
-      <w:bookmarkStart w:id="35" w:name="_Toc243247765"/>
+      <w:bookmarkStart w:id="35" w:name="_Toc243220076"/>
       <w:r>
         <w:t>5.6 What the system demonstrates</w:t>
       </w:r>
@@ -10915,7 +10915,7 @@
       <w:pPr>
         <w:pStyle w:val="Heading2"/>
       </w:pPr>
-      <w:bookmarkStart w:id="36" w:name="_Toc243247766"/>
+      <w:bookmarkStart w:id="36" w:name="_Toc243220077"/>
       <w:r>
         <w:t>References cited in this section</w:t>
       </w:r>
@@ -11042,96 +11042,10 @@
 <file path=word/numbering.xml><?xml version="1.0" encoding="utf-8"?>
 <w:numbering xmlns:wpc="http://schemas.microsoft.com/office/word/2010/wordprocessingCanvas" xmlns:cx="http://schemas.microsoft.com/office/drawing/2014/chartex" xmlns:cx1="http://schemas.microsoft.com/office/drawing/2015/9/8/chartex" xmlns:cx2="http://schemas.microsoft.com/office/drawing/2015/10/21/chartex" xmlns:cx3="http://schemas.microsoft.com/office/drawing/2016/5/9/chartex" xmlns:cx4="http://schemas.microsoft.com/office/drawing/2016/5/10/chartex" xmlns:cx5="http://schemas.microsoft.com/office/drawing/2016/5/11/chartex" xmlns:cx6="http://schemas.microsoft.com/office/drawing/2016/5/12/chartex" xmlns:cx7="http://schemas.microsoft.com/office/drawing/2016/5/13/chartex" xmlns:cx8="http://schemas.microsoft.com/office/drawing/2016/5/14/chartex" xmlns:mc="http://schemas.openxmlformats.org/markup-compatibility/2006" xmlns:aink="http://schemas.microsoft.com/office/drawing/2016/ink" xmlns:am3d="http://schemas.microsoft.com/office/drawing/2017/model3d" xmlns:o="urn:schemas-microsoft-com:office:office" xmlns:oel="http://schemas.microsoft.com/office/2019/extlst" xmlns:r="http://schemas.openxmlformats.org/officeDocument/2006/relationships" xmlns:m="http://schemas.openxmlformats.org/officeDocument/2006/math" xmlns:v="urn:schemas-microsoft-com:vml" xmlns:wp14="http://schemas.microsoft.com/office/word/2010/wordprocessingDrawing" xmlns:wp="http://schemas.openxmlformats.org/drawingml/2006/wordprocessingDrawing" xmlns:w10="urn:schemas-microsoft-com:office:word" xmlns:w="http://schemas.openxmlformats.org/wordprocessingml/2006/main" xmlns:w14="http://schemas.microsoft.com/office/word/2010/wordml" xmlns:w15="http://schemas.microsoft.com/office/word/2012/wordml" xmlns:w16cex="http://schemas.microsoft.com/office/word/2018/wordml/cex" xmlns:w16cid="http://schemas.microsoft.com/office/word/2016/wordml/cid" xmlns:w16="http://schemas.microsoft.com/office/word/2018/wordml" xmlns:w16du="http://schemas.microsoft.com/office/word/2023/wordml/word16du" xmlns:w16sdtdh="http://schemas.microsoft.com/office/word/2020/wordml/sdtdatahash" xmlns:w16sdtfl="http://schemas.microsoft.com/office/word/2024/wordml/sdtformatlock" xmlns:w16se="http://schemas.microsoft.com/office/word/2015/wordml/symex" xmlns:wpg="http://schemas.microsoft.com/office/word/2010/wordprocessingGroup" xmlns:wpi="http://schemas.microsoft.com/office/word/2010/wordprocessingInk" xmlns:wne="http://schemas.microsoft.com/office/word/2006/wordml" xmlns:wps="http://schemas.microsoft.com/office/word/2010/wordprocessingShape" mc:Ignorable="w14 w15 w16se w16cid w16 w16cex w16sdtdh w16sdtfl w16du wp14">
   <w:abstractNum w:abstractNumId="0" w15:restartNumberingAfterBreak="0">
-    <w:nsid w:val="072A0453"/>
+    <w:nsid w:val="59D80054"/>
     <w:multiLevelType w:val="hybridMultilevel"/>
-    <w:tmpl w:val="285CA11C"/>
-    <w:lvl w:ilvl="0" w:tplc="367C9B1C">
-      <w:start w:val="1"/>
-      <w:numFmt w:val="bullet"/>
-      <w:lvlText w:val="●"/>
-      <w:lvlJc w:val="left"/>
-      <w:pPr>
-        <w:ind w:left="720" w:hanging="360"/>
-      </w:pPr>
-    </w:lvl>
-    <w:lvl w:ilvl="1" w:tplc="FBBE5786">
-      <w:start w:val="1"/>
-      <w:numFmt w:val="bullet"/>
-      <w:lvlText w:val="○"/>
-      <w:lvlJc w:val="left"/>
-      <w:pPr>
-        <w:ind w:left="1440" w:hanging="360"/>
-      </w:pPr>
-    </w:lvl>
-    <w:lvl w:ilvl="2" w:tplc="3CC6CDDC">
-      <w:start w:val="1"/>
-      <w:numFmt w:val="bullet"/>
-      <w:lvlText w:val="■"/>
-      <w:lvlJc w:val="left"/>
-      <w:pPr>
-        <w:ind w:left="2160" w:hanging="360"/>
-      </w:pPr>
-    </w:lvl>
-    <w:lvl w:ilvl="3" w:tplc="156AE3C4">
-      <w:start w:val="1"/>
-      <w:numFmt w:val="bullet"/>
-      <w:lvlText w:val="●"/>
-      <w:lvlJc w:val="left"/>
-      <w:pPr>
-        <w:ind w:left="2880" w:hanging="360"/>
-      </w:pPr>
-    </w:lvl>
-    <w:lvl w:ilvl="4" w:tplc="87183A16">
-      <w:start w:val="1"/>
-      <w:numFmt w:val="bullet"/>
-      <w:lvlText w:val="○"/>
-      <w:lvlJc w:val="left"/>
-      <w:pPr>
-        <w:ind w:left="3600" w:hanging="360"/>
-      </w:pPr>
-    </w:lvl>
-    <w:lvl w:ilvl="5" w:tplc="DF348716">
-      <w:start w:val="1"/>
-      <w:numFmt w:val="bullet"/>
-      <w:lvlText w:val="■"/>
-      <w:lvlJc w:val="left"/>
-      <w:pPr>
-        <w:ind w:left="4320" w:hanging="360"/>
-      </w:pPr>
-    </w:lvl>
-    <w:lvl w:ilvl="6" w:tplc="DF28C2EA">
-      <w:start w:val="1"/>
-      <w:numFmt w:val="bullet"/>
-      <w:lvlText w:val="●"/>
-      <w:lvlJc w:val="left"/>
-      <w:pPr>
-        <w:ind w:left="5040" w:hanging="360"/>
-      </w:pPr>
-    </w:lvl>
-    <w:lvl w:ilvl="7" w:tplc="2A94D1A6">
-      <w:start w:val="1"/>
-      <w:numFmt w:val="bullet"/>
-      <w:lvlText w:val="●"/>
-      <w:lvlJc w:val="left"/>
-      <w:pPr>
-        <w:ind w:left="5760" w:hanging="360"/>
-      </w:pPr>
-    </w:lvl>
-    <w:lvl w:ilvl="8" w:tplc="5EC8B128">
-      <w:start w:val="1"/>
-      <w:numFmt w:val="bullet"/>
-      <w:lvlText w:val="●"/>
-      <w:lvlJc w:val="left"/>
-      <w:pPr>
-        <w:ind w:left="6480" w:hanging="360"/>
-      </w:pPr>
-    </w:lvl>
-  </w:abstractNum>
-  <w:abstractNum w:abstractNumId="1" w15:restartNumberingAfterBreak="0">
-    <w:nsid w:val="6A4F2819"/>
-    <w:multiLevelType w:val="hybridMultilevel"/>
-    <w:tmpl w:val="045205D2"/>
-    <w:lvl w:ilvl="0" w:tplc="8138DA34">
+    <w:tmpl w:val="853A9C40"/>
+    <w:lvl w:ilvl="0" w:tplc="BBEE4630">
       <w:start w:val="1"/>
       <w:numFmt w:val="bullet"/>
       <w:lvlText w:val="•"/>
@@ -11140,55 +11054,141 @@
         <w:ind w:left="720" w:hanging="360"/>
       </w:pPr>
     </w:lvl>
-    <w:lvl w:ilvl="1" w:tplc="AD9605C2">
+    <w:lvl w:ilvl="1" w:tplc="FCD4EDFE">
       <w:numFmt w:val="decimal"/>
       <w:lvlText w:val=""/>
       <w:lvlJc w:val="left"/>
     </w:lvl>
-    <w:lvl w:ilvl="2" w:tplc="234ECF54">
+    <w:lvl w:ilvl="2" w:tplc="D3D6389E">
       <w:numFmt w:val="decimal"/>
       <w:lvlText w:val=""/>
       <w:lvlJc w:val="left"/>
     </w:lvl>
-    <w:lvl w:ilvl="3" w:tplc="85F8E8C2">
+    <w:lvl w:ilvl="3" w:tplc="65084868">
       <w:numFmt w:val="decimal"/>
       <w:lvlText w:val=""/>
       <w:lvlJc w:val="left"/>
     </w:lvl>
-    <w:lvl w:ilvl="4" w:tplc="D744C476">
+    <w:lvl w:ilvl="4" w:tplc="0B2032E2">
       <w:numFmt w:val="decimal"/>
       <w:lvlText w:val=""/>
       <w:lvlJc w:val="left"/>
     </w:lvl>
-    <w:lvl w:ilvl="5" w:tplc="907C8CE0">
+    <w:lvl w:ilvl="5" w:tplc="665C4C64">
       <w:numFmt w:val="decimal"/>
       <w:lvlText w:val=""/>
       <w:lvlJc w:val="left"/>
     </w:lvl>
-    <w:lvl w:ilvl="6" w:tplc="F258BB74">
+    <w:lvl w:ilvl="6" w:tplc="2B14E346">
       <w:numFmt w:val="decimal"/>
       <w:lvlText w:val=""/>
       <w:lvlJc w:val="left"/>
     </w:lvl>
-    <w:lvl w:ilvl="7" w:tplc="E9028674">
+    <w:lvl w:ilvl="7" w:tplc="7CECF12C">
       <w:numFmt w:val="decimal"/>
       <w:lvlText w:val=""/>
       <w:lvlJc w:val="left"/>
     </w:lvl>
-    <w:lvl w:ilvl="8" w:tplc="89A87248">
+    <w:lvl w:ilvl="8" w:tplc="D2EA0A52">
       <w:numFmt w:val="decimal"/>
       <w:lvlText w:val=""/>
       <w:lvlJc w:val="left"/>
     </w:lvl>
   </w:abstractNum>
-  <w:num w:numId="1" w16cid:durableId="224224595">
-    <w:abstractNumId w:val="0"/>
+  <w:abstractNum w:abstractNumId="1" w15:restartNumberingAfterBreak="0">
+    <w:nsid w:val="6F445334"/>
+    <w:multiLevelType w:val="hybridMultilevel"/>
+    <w:tmpl w:val="9322E474"/>
+    <w:lvl w:ilvl="0" w:tplc="FD0EAC96">
+      <w:start w:val="1"/>
+      <w:numFmt w:val="bullet"/>
+      <w:lvlText w:val="●"/>
+      <w:lvlJc w:val="left"/>
+      <w:pPr>
+        <w:ind w:left="720" w:hanging="360"/>
+      </w:pPr>
+    </w:lvl>
+    <w:lvl w:ilvl="1" w:tplc="91DE8628">
+      <w:start w:val="1"/>
+      <w:numFmt w:val="bullet"/>
+      <w:lvlText w:val="○"/>
+      <w:lvlJc w:val="left"/>
+      <w:pPr>
+        <w:ind w:left="1440" w:hanging="360"/>
+      </w:pPr>
+    </w:lvl>
+    <w:lvl w:ilvl="2" w:tplc="4EF0C656">
+      <w:start w:val="1"/>
+      <w:numFmt w:val="bullet"/>
+      <w:lvlText w:val="■"/>
+      <w:lvlJc w:val="left"/>
+      <w:pPr>
+        <w:ind w:left="2160" w:hanging="360"/>
+      </w:pPr>
+    </w:lvl>
+    <w:lvl w:ilvl="3" w:tplc="7152E232">
+      <w:start w:val="1"/>
+      <w:numFmt w:val="bullet"/>
+      <w:lvlText w:val="●"/>
+      <w:lvlJc w:val="left"/>
+      <w:pPr>
+        <w:ind w:left="2880" w:hanging="360"/>
+      </w:pPr>
+    </w:lvl>
+    <w:lvl w:ilvl="4" w:tplc="2026C1AA">
+      <w:start w:val="1"/>
+      <w:numFmt w:val="bullet"/>
+      <w:lvlText w:val="○"/>
+      <w:lvlJc w:val="left"/>
+      <w:pPr>
+        <w:ind w:left="3600" w:hanging="360"/>
+      </w:pPr>
+    </w:lvl>
+    <w:lvl w:ilvl="5" w:tplc="38CA0578">
+      <w:start w:val="1"/>
+      <w:numFmt w:val="bullet"/>
+      <w:lvlText w:val="■"/>
+      <w:lvlJc w:val="left"/>
+      <w:pPr>
+        <w:ind w:left="4320" w:hanging="360"/>
+      </w:pPr>
+    </w:lvl>
+    <w:lvl w:ilvl="6" w:tplc="14F6939A">
+      <w:start w:val="1"/>
+      <w:numFmt w:val="bullet"/>
+      <w:lvlText w:val="●"/>
+      <w:lvlJc w:val="left"/>
+      <w:pPr>
+        <w:ind w:left="5040" w:hanging="360"/>
+      </w:pPr>
+    </w:lvl>
+    <w:lvl w:ilvl="7" w:tplc="FE603D1E">
+      <w:start w:val="1"/>
+      <w:numFmt w:val="bullet"/>
+      <w:lvlText w:val="●"/>
+      <w:lvlJc w:val="left"/>
+      <w:pPr>
+        <w:ind w:left="5760" w:hanging="360"/>
+      </w:pPr>
+    </w:lvl>
+    <w:lvl w:ilvl="8" w:tplc="164E1C4E">
+      <w:start w:val="1"/>
+      <w:numFmt w:val="bullet"/>
+      <w:lvlText w:val="●"/>
+      <w:lvlJc w:val="left"/>
+      <w:pPr>
+        <w:ind w:left="6480" w:hanging="360"/>
+      </w:pPr>
+    </w:lvl>
+  </w:abstractNum>
+  <w:num w:numId="1" w16cid:durableId="414129140">
+    <w:abstractNumId w:val="1"/>
     <w:lvlOverride w:ilvl="0">
       <w:startOverride w:val="1"/>
     </w:lvlOverride>
   </w:num>
-  <w:num w:numId="2" w16cid:durableId="640884718">
-    <w:abstractNumId w:val="1"/>
+  <w:num w:numId="2" w16cid:durableId="815561599">
+    <w:abstractNumId w:val="0"/>
     <w:lvlOverride w:ilvl="0">
       <w:startOverride w:val="1"/>
     </w:lvlOverride>
@@ -11777,7 +11777,7 @@
     <w:autoRedefine/>
     <w:uiPriority w:val="39"/>
     <w:unhideWhenUsed/>
-    <w:rsid w:val="006254E7"/>
+    <w:rsid w:val="00DA7748"/>
     <w:pPr>
       <w:spacing w:after="100"/>
     </w:pPr>
@@ -11789,7 +11789,7 @@
     <w:autoRedefine/>
     <w:uiPriority w:val="39"/>
     <w:unhideWhenUsed/>
-    <w:rsid w:val="006254E7"/>
+    <w:rsid w:val="00DA7748"/>
     <w:pPr>
       <w:spacing w:after="100"/>
       <w:ind w:left="220"/>

</xml_diff>